<commit_message>
fix: move template to correct path security/results/report_template.docx
</commit_message>
<xml_diff>
--- a/security/results/report_template.docx
+++ b/security/results/report_template.docx
@@ -23595,18 +23595,19 @@
               <w:jc w:val="center"/>
               <w:rPr>
                 <w:rFonts w:ascii="Times New Roman" w:hAnsi="Times New Roman" w:cs="Times New Roman"/>
-                <w:sz w:val="22"/>
-                <w:szCs w:val="22"/>
-              </w:rPr>
-            </w:pPr>
-            <w:r>
-              <w:rPr>
-                <w:rFonts w:ascii="Times New Roman" w:hAnsi="Times New Roman" w:cs="Times New Roman"/>
-                <w:color w:val="0070C0"/>
-                <w:sz w:val="22"/>
-                <w:szCs w:val="22"/>
-              </w:rPr>
-              <w:t>{UniqueID}</w:t>
+                <w:color w:val="0070C0"/>
+                <w:sz w:val="22"/>
+                <w:szCs w:val="22"/>
+              </w:rPr>
+            </w:pPr>
+            <w:r>
+              <w:rPr>
+                <w:rFonts w:ascii="Times New Roman" w:hAnsi="Times New Roman" w:cs="Times New Roman"/>
+                <w:color w:val="0070C0"/>
+                <w:sz w:val="22"/>
+                <w:szCs w:val="22"/>
+              </w:rPr>
+              <w:t>{Evidence_1_MappedControl}</w:t>
             </w:r>
           </w:p>
         </w:tc>
@@ -23744,18 +23745,19 @@
               <w:jc w:val="center"/>
               <w:rPr>
                 <w:rFonts w:ascii="Times New Roman" w:hAnsi="Times New Roman" w:cs="Times New Roman"/>
-                <w:sz w:val="22"/>
-                <w:szCs w:val="22"/>
-              </w:rPr>
-            </w:pPr>
-            <w:r>
-              <w:rPr>
-                <w:rFonts w:ascii="Times New Roman" w:hAnsi="Times New Roman" w:cs="Times New Roman"/>
-                <w:color w:val="0070C0"/>
-                <w:sz w:val="22"/>
-                <w:szCs w:val="22"/>
-              </w:rPr>
-              <w:t>{UniqueID}</w:t>
+                <w:color w:val="0070C0"/>
+                <w:sz w:val="22"/>
+                <w:szCs w:val="22"/>
+              </w:rPr>
+            </w:pPr>
+            <w:r>
+              <w:rPr>
+                <w:rFonts w:ascii="Times New Roman" w:hAnsi="Times New Roman" w:cs="Times New Roman"/>
+                <w:color w:val="0070C0"/>
+                <w:sz w:val="22"/>
+                <w:szCs w:val="22"/>
+              </w:rPr>
+              <w:t>{Evidence_2_MappedControl}</w:t>
             </w:r>
           </w:p>
         </w:tc>
@@ -23889,18 +23891,19 @@
               <w:jc w:val="center"/>
               <w:rPr>
                 <w:rFonts w:ascii="Times New Roman" w:hAnsi="Times New Roman" w:cs="Times New Roman"/>
-                <w:sz w:val="22"/>
-                <w:szCs w:val="22"/>
-              </w:rPr>
-            </w:pPr>
-            <w:r>
-              <w:rPr>
-                <w:rFonts w:ascii="Times New Roman" w:hAnsi="Times New Roman" w:cs="Times New Roman"/>
-                <w:color w:val="0070C0"/>
-                <w:sz w:val="22"/>
-                <w:szCs w:val="22"/>
-              </w:rPr>
-              <w:t>{UniqueID}</w:t>
+                <w:color w:val="0070C0"/>
+                <w:sz w:val="22"/>
+                <w:szCs w:val="22"/>
+              </w:rPr>
+            </w:pPr>
+            <w:r>
+              <w:rPr>
+                <w:rFonts w:ascii="Times New Roman" w:hAnsi="Times New Roman" w:cs="Times New Roman"/>
+                <w:color w:val="0070C0"/>
+                <w:sz w:val="22"/>
+                <w:szCs w:val="22"/>
+              </w:rPr>
+              <w:t>{Evidence_3_MappedControl}</w:t>
             </w:r>
           </w:p>
         </w:tc>
@@ -24035,18 +24038,19 @@
               <w:jc w:val="center"/>
               <w:rPr>
                 <w:rFonts w:ascii="Times New Roman" w:hAnsi="Times New Roman" w:cs="Times New Roman"/>
-                <w:sz w:val="22"/>
-                <w:szCs w:val="22"/>
-              </w:rPr>
-            </w:pPr>
-            <w:r>
-              <w:rPr>
-                <w:rFonts w:ascii="Times New Roman" w:hAnsi="Times New Roman" w:cs="Times New Roman"/>
-                <w:color w:val="0070C0"/>
-                <w:sz w:val="22"/>
-                <w:szCs w:val="22"/>
-              </w:rPr>
-              <w:t>{UniqueID}</w:t>
+                <w:color w:val="0070C0"/>
+                <w:sz w:val="22"/>
+                <w:szCs w:val="22"/>
+              </w:rPr>
+            </w:pPr>
+            <w:r>
+              <w:rPr>
+                <w:rFonts w:ascii="Times New Roman" w:hAnsi="Times New Roman" w:cs="Times New Roman"/>
+                <w:color w:val="0070C0"/>
+                <w:sz w:val="22"/>
+                <w:szCs w:val="22"/>
+              </w:rPr>
+              <w:t>{Evidence_4_MappedControl}</w:t>
             </w:r>
           </w:p>
         </w:tc>
@@ -24180,18 +24184,19 @@
               <w:jc w:val="center"/>
               <w:rPr>
                 <w:rFonts w:ascii="Times New Roman" w:hAnsi="Times New Roman" w:cs="Times New Roman"/>
-                <w:sz w:val="22"/>
-                <w:szCs w:val="22"/>
-              </w:rPr>
-            </w:pPr>
-            <w:r>
-              <w:rPr>
-                <w:rFonts w:ascii="Times New Roman" w:hAnsi="Times New Roman" w:cs="Times New Roman"/>
-                <w:color w:val="0070C0"/>
-                <w:sz w:val="22"/>
-                <w:szCs w:val="22"/>
-              </w:rPr>
-              <w:t>{UniqueID}</w:t>
+                <w:color w:val="0070C0"/>
+                <w:sz w:val="22"/>
+                <w:szCs w:val="22"/>
+              </w:rPr>
+            </w:pPr>
+            <w:r>
+              <w:rPr>
+                <w:rFonts w:ascii="Times New Roman" w:hAnsi="Times New Roman" w:cs="Times New Roman"/>
+                <w:color w:val="0070C0"/>
+                <w:sz w:val="22"/>
+                <w:szCs w:val="22"/>
+              </w:rPr>
+              <w:t>{Evidence_5_MappedControl}</w:t>
             </w:r>
           </w:p>
         </w:tc>
@@ -24326,18 +24331,19 @@
               <w:jc w:val="center"/>
               <w:rPr>
                 <w:rFonts w:ascii="Times New Roman" w:hAnsi="Times New Roman" w:cs="Times New Roman"/>
-                <w:sz w:val="22"/>
-                <w:szCs w:val="22"/>
-              </w:rPr>
-            </w:pPr>
-            <w:r>
-              <w:rPr>
-                <w:rFonts w:ascii="Times New Roman" w:hAnsi="Times New Roman" w:cs="Times New Roman"/>
-                <w:color w:val="0070C0"/>
-                <w:sz w:val="22"/>
-                <w:szCs w:val="22"/>
-              </w:rPr>
-              <w:t>{UniqueID}</w:t>
+                <w:color w:val="0070C0"/>
+                <w:sz w:val="22"/>
+                <w:szCs w:val="22"/>
+              </w:rPr>
+            </w:pPr>
+            <w:r>
+              <w:rPr>
+                <w:rFonts w:ascii="Times New Roman" w:hAnsi="Times New Roman" w:cs="Times New Roman"/>
+                <w:color w:val="0070C0"/>
+                <w:sz w:val="22"/>
+                <w:szCs w:val="22"/>
+              </w:rPr>
+              <w:t>{Evidence_6_MappedControl}</w:t>
             </w:r>
           </w:p>
         </w:tc>
@@ -24471,18 +24477,19 @@
               <w:jc w:val="center"/>
               <w:rPr>
                 <w:rFonts w:ascii="Times New Roman" w:hAnsi="Times New Roman" w:cs="Times New Roman"/>
-                <w:sz w:val="22"/>
-                <w:szCs w:val="22"/>
-              </w:rPr>
-            </w:pPr>
-            <w:r>
-              <w:rPr>
-                <w:rFonts w:ascii="Times New Roman" w:hAnsi="Times New Roman" w:cs="Times New Roman"/>
-                <w:color w:val="0070C0"/>
-                <w:sz w:val="22"/>
-                <w:szCs w:val="22"/>
-              </w:rPr>
-              <w:t>{UniqueID}</w:t>
+                <w:color w:val="0070C0"/>
+                <w:sz w:val="22"/>
+                <w:szCs w:val="22"/>
+              </w:rPr>
+            </w:pPr>
+            <w:r>
+              <w:rPr>
+                <w:rFonts w:ascii="Times New Roman" w:hAnsi="Times New Roman" w:cs="Times New Roman"/>
+                <w:color w:val="0070C0"/>
+                <w:sz w:val="22"/>
+                <w:szCs w:val="22"/>
+              </w:rPr>
+              <w:t>{Evidence_7_MappedControl}</w:t>
             </w:r>
           </w:p>
         </w:tc>
@@ -24617,18 +24624,19 @@
               <w:jc w:val="center"/>
               <w:rPr>
                 <w:rFonts w:ascii="Times New Roman" w:hAnsi="Times New Roman" w:cs="Times New Roman"/>
-                <w:sz w:val="22"/>
-                <w:szCs w:val="22"/>
-              </w:rPr>
-            </w:pPr>
-            <w:r>
-              <w:rPr>
-                <w:rFonts w:ascii="Times New Roman" w:hAnsi="Times New Roman" w:cs="Times New Roman"/>
-                <w:color w:val="0070C0"/>
-                <w:sz w:val="22"/>
-                <w:szCs w:val="22"/>
-              </w:rPr>
-              <w:t>{UniqueID}</w:t>
+                <w:color w:val="0070C0"/>
+                <w:sz w:val="22"/>
+                <w:szCs w:val="22"/>
+              </w:rPr>
+            </w:pPr>
+            <w:r>
+              <w:rPr>
+                <w:rFonts w:ascii="Times New Roman" w:hAnsi="Times New Roman" w:cs="Times New Roman"/>
+                <w:color w:val="0070C0"/>
+                <w:sz w:val="22"/>
+                <w:szCs w:val="22"/>
+              </w:rPr>
+              <w:t>{Evidence_8_MappedControl}</w:t>
             </w:r>
           </w:p>
         </w:tc>
@@ -24759,18 +24767,19 @@
               <w:jc w:val="center"/>
               <w:rPr>
                 <w:rFonts w:ascii="Times New Roman" w:hAnsi="Times New Roman" w:cs="Times New Roman"/>
-                <w:sz w:val="22"/>
-                <w:szCs w:val="22"/>
-              </w:rPr>
-            </w:pPr>
-            <w:r>
-              <w:rPr>
-                <w:rFonts w:ascii="Times New Roman" w:hAnsi="Times New Roman" w:cs="Times New Roman"/>
-                <w:color w:val="0070C0"/>
-                <w:sz w:val="22"/>
-                <w:szCs w:val="22"/>
-              </w:rPr>
-              <w:t>{UniqueID}</w:t>
+                <w:color w:val="0070C0"/>
+                <w:sz w:val="22"/>
+                <w:szCs w:val="22"/>
+              </w:rPr>
+            </w:pPr>
+            <w:r>
+              <w:rPr>
+                <w:rFonts w:ascii="Times New Roman" w:hAnsi="Times New Roman" w:cs="Times New Roman"/>
+                <w:color w:val="0070C0"/>
+                <w:sz w:val="22"/>
+                <w:szCs w:val="22"/>
+              </w:rPr>
+              <w:t>{Evidence_9_MappedControl}</w:t>
             </w:r>
           </w:p>
         </w:tc>
@@ -24900,18 +24909,19 @@
               <w:jc w:val="center"/>
               <w:rPr>
                 <w:rFonts w:ascii="Times New Roman" w:hAnsi="Times New Roman" w:cs="Times New Roman"/>
-                <w:sz w:val="22"/>
-                <w:szCs w:val="22"/>
-              </w:rPr>
-            </w:pPr>
-            <w:r>
-              <w:rPr>
-                <w:rFonts w:ascii="Times New Roman" w:hAnsi="Times New Roman" w:cs="Times New Roman"/>
-                <w:color w:val="0070C0"/>
-                <w:sz w:val="22"/>
-                <w:szCs w:val="22"/>
-              </w:rPr>
-              <w:t>{UniqueID}</w:t>
+                <w:color w:val="0070C0"/>
+                <w:sz w:val="22"/>
+                <w:szCs w:val="22"/>
+              </w:rPr>
+            </w:pPr>
+            <w:r>
+              <w:rPr>
+                <w:rFonts w:ascii="Times New Roman" w:hAnsi="Times New Roman" w:cs="Times New Roman"/>
+                <w:color w:val="0070C0"/>
+                <w:sz w:val="22"/>
+                <w:szCs w:val="22"/>
+              </w:rPr>
+              <w:t>{Evidence_10_MappedControl}</w:t>
             </w:r>
           </w:p>
         </w:tc>
@@ -24942,54 +24952,6 @@
         </w:tc>
       </w:tr>
     </w:tbl>
-    <w:p>
-      <w:pPr>
-        <w:spacing w:line="276" w:lineRule="auto"/>
-        <w:rPr>
-          <w:rFonts w:ascii="Times New Roman" w:hAnsi="Times New Roman" w:cs="Times New Roman"/>
-          <w:b/>
-          <w:bCs/>
-          <w:sz w:val="32"/>
-          <w:szCs w:val="32"/>
-        </w:rPr>
-      </w:pPr>
-    </w:p>
-    <w:p>
-      <w:pPr>
-        <w:spacing w:line="276" w:lineRule="auto"/>
-        <w:rPr>
-          <w:rFonts w:ascii="Times New Roman" w:hAnsi="Times New Roman" w:cs="Times New Roman"/>
-          <w:b/>
-          <w:bCs/>
-          <w:sz w:val="32"/>
-          <w:szCs w:val="32"/>
-        </w:rPr>
-      </w:pPr>
-    </w:p>
-    <w:p>
-      <w:pPr>
-        <w:spacing w:line="276" w:lineRule="auto"/>
-        <w:rPr>
-          <w:rFonts w:ascii="Times New Roman" w:hAnsi="Times New Roman" w:cs="Times New Roman"/>
-          <w:b/>
-          <w:bCs/>
-          <w:sz w:val="32"/>
-          <w:szCs w:val="32"/>
-        </w:rPr>
-      </w:pPr>
-    </w:p>
-    <w:p>
-      <w:pPr>
-        <w:spacing w:line="276" w:lineRule="auto"/>
-        <w:rPr>
-          <w:rFonts w:ascii="Times New Roman" w:hAnsi="Times New Roman" w:cs="Times New Roman"/>
-          <w:b/>
-          <w:bCs/>
-          <w:sz w:val="32"/>
-          <w:szCs w:val="32"/>
-        </w:rPr>
-      </w:pPr>
-    </w:p>
     <w:p>
       <w:pPr>
         <w:spacing w:line="276" w:lineRule="auto"/>

</xml_diff>

<commit_message>
feat: update report service and template with dynamic findings and evidence extracts [26T1-DOC-RR-001]
</commit_message>
<xml_diff>
--- a/security/results/report_template.docx
+++ b/security/results/report_template.docx
@@ -87,7 +87,7 @@
           </mc:Choice>
           <mc:Fallback>
             <w:pict>
-              <v:rect w14:anchorId="2FF27CBF" id="Rectangle 3" o:spid="_x0000_s1026" style="position:absolute;margin-left:-2.9pt;margin-top:-11.5pt;width:456.85pt;height:17.3pt;z-index:251659264;visibility:visible;mso-wrap-style:square;mso-width-percent:0;mso-height-percent:0;mso-wrap-distance-left:9pt;mso-wrap-distance-top:0;mso-wrap-distance-right:9pt;mso-wrap-distance-bottom:0;mso-position-horizontal:absolute;mso-position-horizontal-relative:text;mso-position-vertical:absolute;mso-position-vertical-relative:text;mso-width-percent:0;mso-height-percent:0;mso-width-relative:margin;mso-height-relative:margin;v-text-anchor:middle" o:gfxdata="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" fillcolor="black [3200]" strokecolor="black [480]" strokeweight="1pt"/>
+              <v:rect w14:anchorId="2FF27CBF" id="Rectangle 3" o:spid="_x0000_s1026" style="position:absolute;margin-left:-2.9pt;margin-top:-11.5pt;width:456.85pt;height:17.3pt;z-index:251659264;visibility:visible;mso-wrap-style:square;mso-width-percent:0;mso-height-percent:0;mso-wrap-distance-left:9pt;mso-wrap-distance-top:0;mso-wrap-distance-right:9pt;mso-wrap-distance-bottom:0;mso-position-horizontal:absolute;mso-position-horizontal-relative:text;mso-position-vertical:absolute;mso-position-vertical-relative:text;mso-width-percent:0;mso-height-percent:0;mso-width-relative:margin;mso-height-relative:margin;v-text-anchor:middle" o:gfxdata="UEsDBBQABgAIAAAAIQC2gziS/gAAAOEBAAATAAAAW0NvbnRlbnRfVHlwZXNdLnhtbJSRQU7DMBBF 90jcwfIWJU67QAgl6YK0S0CoHGBkTxKLZGx5TGhvj5O2G0SRWNoz/78nu9wcxkFMGNg6quQqL6RA 0s5Y6ir5vt9lD1JwBDIwOMJKHpHlpr69KfdHjyxSmriSfYz+USnWPY7AufNIadK6MEJMx9ApD/oD OlTrorhX2lFEilmcO2RdNtjC5xDF9pCuTyYBB5bi6bQ4syoJ3g9WQ0ymaiLzg5KdCXlKLjvcW893 SUOqXwnz5DrgnHtJTxOsQfEKIT7DmDSUCaxw7Rqn8787ZsmRM9e2VmPeBN4uqYvTtW7jvijg9N/y JsXecLq0q+WD6m8AAAD//wMAUEsDBBQABgAIAAAAIQA4/SH/1gAAAJQBAAALAAAAX3JlbHMvLnJl bHOkkMFqwzAMhu+DvYPRfXGawxijTi+j0GvpHsDYimMaW0Yy2fr2M4PBMnrbUb/Q94l/f/hMi1qR JVI2sOt6UJgd+ZiDgffL8ekFlFSbvV0oo4EbChzGx4f9GRdb25HMsYhqlCwG5lrLq9biZkxWOiqY 22YiTra2kYMu1l1tQD30/bPm3wwYN0x18gb45AdQl1tp5j/sFB2T0FQ7R0nTNEV3j6o9feQzro1i OWA14Fm+Q8a1a8+Bvu/d/dMb2JY5uiPbhG/ktn4cqGU/er3pcvwCAAD//wMAUEsDBBQABgAIAAAA IQBwmVduXAIAAAcFAAAOAAAAZHJzL2Uyb0RvYy54bWysVMFu2zAMvQ/YPwi6r7aDpGuCOkXQosOA oi2aDj2rslQbk0WNUuJkXz9Kdpyu6y7DLjIlko/U06PPL3atYVuFvgFb8uIk50xZCVVjX0r+7fH6 0xlnPghbCQNWlXyvPL9Yfvxw3rmFmkANplLICMT6RedKXofgFlnmZa1a4U/AKUtODdiKQFt8ySoU HaG3Jpvk+WnWAVYOQSrv6fSqd/JlwtdayXCntVeBmZJTbyGtmNbnuGbLc7F4QeHqRg5tiH/oohWN paIj1JUIgm2w+QOqbSSCBx1OJLQZaN1Ile5AtynyN7dZ18KpdBcix7uRJv//YOXtdu3ukWjonF94 MuMtdhrb+KX+2C6RtR/JUrvAJB3OzvJiPp9xJsk3KebT2WlkMztmO/Thi4KWRaPkSI+ROBLbGx/6 0EMI5R3rJyvsjYotGPugNGsqqjhJ2Uka6tIg2wp61Op70R/XolL9UTHL8/Sy1MsYnTpLYBFVN8aM uANAlNzvuH2PQ2xMU0lRY2L+t4b6xDE6VQQbxsS2sYDvJZtQDCTqPv5ATE9HZOYZqv09MoRey97J 64b4vRE+3Ask8ZLMaSDDHS3aQFdyGCzOasCf753HeNIUeTnraBhK7n9sBCrOzFdLapsX02mcnrSZ zj5PaIOvPc+vPXbTXgI9TUGj72QyY3wwB1MjtE80t6tYlVzCSqpdchnwsLkM/ZDS5Eu1WqUwmhgn wo1dOxnBI6tRP4+7J4FuEFkged7CYXDE4o3W+tiYaWG1CaCbJMQjrwPfNG1JMMOfIY7z632KOv6/ lr8AAAD//wMAUEsDBBQABgAIAAAAIQDg2NJp4wAAAA4BAAAPAAAAZHJzL2Rvd25yZXYueG1sTI9B T8MwDIXvSPyHyEhc0JZsE4N1TadpqOIGauHAMUtCWtE4pcm67t9jTnCxZfn5+Xv5bvIdG+0Q24AS FnMBzKIOpkUn4f2tnD0Ci0mhUV1AK+FiI+yK66tcZSacsbJjnRwjE4yZktCk1GecR91Yr+I89BZp 9xkGrxKNg+NmUGcy9x1fCrHmXrVIHxrV20Nj9Vd98hJGUZXuQ1+edVl/u7vq5XWFepTy9mZ62lLZ b4ElO6W/C/jNQPxQENgxnNBE1kmY3RN+or5cUTASbMTDBtiRlIs18CLn/2MUPwAAAP//AwBQSwEC LQAUAAYACAAAACEAtoM4kv4AAADhAQAAEwAAAAAAAAAAAAAAAAAAAAAAW0NvbnRlbnRfVHlwZXNd LnhtbFBLAQItABQABgAIAAAAIQA4/SH/1gAAAJQBAAALAAAAAAAAAAAAAAAAAC8BAABfcmVscy8u cmVsc1BLAQItABQABgAIAAAAIQBwmVduXAIAAAcFAAAOAAAAAAAAAAAAAAAAAC4CAABkcnMvZTJv RG9jLnhtbFBLAQItABQABgAIAAAAIQDg2NJp4wAAAA4BAAAPAAAAAAAAAAAAAAAAALYEAABkcnMv ZG93bnJldi54bWxQSwUGAAAAAAQABADzAAAAxgUAAAAA " fillcolor="black [3200]" strokecolor="black [480]" strokeweight="1pt"/>
             </w:pict>
           </mc:Fallback>
         </mc:AlternateContent>
@@ -247,25 +247,7 @@
                 <w:sz w:val="22"/>
                 <w:szCs w:val="22"/>
               </w:rPr>
-              <w:t>{</w:t>
-            </w:r>
-            <w:r>
-              <w:rPr>
-                <w:rFonts w:ascii="Times New Roman" w:hAnsi="Times New Roman" w:cs="Times New Roman"/>
-                <w:color w:val="0070C0"/>
-                <w:sz w:val="22"/>
-                <w:szCs w:val="22"/>
-              </w:rPr>
-              <w:t>Tenant_Name</w:t>
-            </w:r>
-            <w:r>
-              <w:rPr>
-                <w:rFonts w:ascii="Times New Roman" w:hAnsi="Times New Roman" w:cs="Times New Roman"/>
-                <w:color w:val="0070C0"/>
-                <w:sz w:val="22"/>
-                <w:szCs w:val="22"/>
-              </w:rPr>
-              <w:t>}</w:t>
+              <w:t>{Tenant_Name}</w:t>
             </w:r>
           </w:p>
           <w:p>
@@ -972,7 +954,7 @@
           </mc:Choice>
           <mc:Fallback>
             <w:pict>
-              <v:rect w14:anchorId="26002F29" id="Rectangle 3" o:spid="_x0000_s1026" style="position:absolute;margin-left:-2.75pt;margin-top:764.65pt;width:456.85pt;height:17.25pt;z-index:-251655168;visibility:visible;mso-wrap-style:square;mso-width-percent:0;mso-height-percent:0;mso-wrap-distance-left:9pt;mso-wrap-distance-top:0;mso-wrap-distance-right:9pt;mso-wrap-distance-bottom:0;mso-position-horizontal:absolute;mso-position-horizontal-relative:text;mso-position-vertical:absolute;mso-position-vertical-relative:page;mso-width-percent:0;mso-height-percent:0;mso-width-relative:margin;mso-height-relative:margin;v-text-anchor:middle" o:gfxdata="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" fillcolor="black [3200]" strokecolor="black [480]" strokeweight="1pt">
+              <v:rect w14:anchorId="26002F29" id="Rectangle 3" o:spid="_x0000_s1026" style="position:absolute;margin-left:-2.75pt;margin-top:764.65pt;width:456.85pt;height:17.25pt;z-index:-251655168;visibility:visible;mso-wrap-style:square;mso-width-percent:0;mso-height-percent:0;mso-wrap-distance-left:9pt;mso-wrap-distance-top:0;mso-wrap-distance-right:9pt;mso-wrap-distance-bottom:0;mso-position-horizontal:absolute;mso-position-horizontal-relative:text;mso-position-vertical:absolute;mso-position-vertical-relative:page;mso-width-percent:0;mso-height-percent:0;mso-width-relative:margin;mso-height-relative:margin;v-text-anchor:middle" o:gfxdata="UEsDBBQABgAIAAAAIQC2gziS/gAAAOEBAAATAAAAW0NvbnRlbnRfVHlwZXNdLnhtbJSRQU7DMBBF 90jcwfIWJU67QAgl6YK0S0CoHGBkTxKLZGx5TGhvj5O2G0SRWNoz/78nu9wcxkFMGNg6quQqL6RA 0s5Y6ir5vt9lD1JwBDIwOMJKHpHlpr69KfdHjyxSmriSfYz+USnWPY7AufNIadK6MEJMx9ApD/oD OlTrorhX2lFEilmcO2RdNtjC5xDF9pCuTyYBB5bi6bQ4syoJ3g9WQ0ymaiLzg5KdCXlKLjvcW893 SUOqXwnz5DrgnHtJTxOsQfEKIT7DmDSUCaxw7Rqn8787ZsmRM9e2VmPeBN4uqYvTtW7jvijg9N/y JsXecLq0q+WD6m8AAAD//wMAUEsDBBQABgAIAAAAIQA4/SH/1gAAAJQBAAALAAAAX3JlbHMvLnJl bHOkkMFqwzAMhu+DvYPRfXGawxijTi+j0GvpHsDYimMaW0Yy2fr2M4PBMnrbUb/Q94l/f/hMi1qR JVI2sOt6UJgd+ZiDgffL8ekFlFSbvV0oo4EbChzGx4f9GRdb25HMsYhqlCwG5lrLq9biZkxWOiqY 22YiTra2kYMu1l1tQD30/bPm3wwYN0x18gb45AdQl1tp5j/sFB2T0FQ7R0nTNEV3j6o9feQzro1i OWA14Fm+Q8a1a8+Bvu/d/dMb2JY5uiPbhG/ktn4cqGU/er3pcvwCAAD//wMAUEsDBBQABgAIAAAA IQC4wNYgXAIAAAcFAAAOAAAAZHJzL2Uyb0RvYy54bWysVMFu2zAMvQ/YPwi6r7aDZG2COkWQosOA oi3aDj2rslQbk0WNUuJkXz9Kdpyu6y7DLjIlko/U06PPL3atYVuFvgFb8uIk50xZCVVjX0r+7fHq 0xlnPghbCQNWlXyvPL9Yfvxw3rmFmkANplLICMT6RedKXofgFlnmZa1a4U/AKUtODdiKQFt8ySoU HaG3Jpvk+eesA6wcglTe0+ll7+TLhK+1kuFWa68CMyWn3kJaMa3Pcc2W52LxgsLVjRzaEP/QRSsa S0VHqEsRBNtg8wdU20gEDzqcSGgz0LqRKt2BblPkb27zUAun0l2IHO9Gmvz/g5U32wd3h0RD5/zC kxlvsdPYxi/1x3aJrP1IltoFJulwdpYX8/mMM0m+STHPT2eRzeyY7dCHLwpaFo2SIz1G4khsr33o Qw8hlHesn6ywNyq2YOy90qypqOIkZSdpqLVBthX0qNX3oj+uRaX6o2KW5+llqZcxOnWWwCKqbowZ cQeAKLnfcfseh9iYppKixsT8bw31iWN0qgg2jIltYwHfSzahGEjUffyBmJ6OyMwzVPs7ZAi9lr2T Vw3xey18uBNI4iWZ00CGW1q0ga7kMFic1YA/3zuP8aQp8nLW0TCU3P/YCFScma+W1DYvptM4PWkz nZ1OaIOvPc+vPXbTroGepqDRdzKZMT6Yg6kR2iea21WsSi5hJdUuuQx42KxDP6Q0+VKtVimMJsaJ cG0fnIzgkdWon8fdk0A3iCyQPG/gMDhi8UZrfWzMtLDaBNBNEuKR14FvmrYkmOHPEMf59T5FHf9f y18AAAD//wMAUEsDBBQABgAIAAAAIQDfV+cG5AAAABEBAAAPAAAAZHJzL2Rvd25yZXYueG1sTE9N T4NAEL2b+B82Y+LFtIsQGkpZGqMh3jSgB4/b3RWI7CyyW0r/vdNTvUwyb968j2K/2IHNZvK9QwGP 6wiYQeV0j62Az49qlQHzQaKWg0Mj4Gw87Mvbm0Lm2p2wNnMTWkYi6HMpoAthzDn3qjNW+rUbDdLt 201WBlqnlutJnkjcDjyOog23skdy6ORonjujfpqjFTBHddV+qfOrqprf9qF+e09QzULc3y0vOxpP O2DBLOH6AZcOlB9KCnZwR9SeDQJWaUpMwtN4mwAjxjbKYmCHC7RJMuBlwf83Kf8AAAD//wMAUEsB Ai0AFAAGAAgAAAAhALaDOJL+AAAA4QEAABMAAAAAAAAAAAAAAAAAAAAAAFtDb250ZW50X1R5cGVz XS54bWxQSwECLQAUAAYACAAAACEAOP0h/9YAAACUAQAACwAAAAAAAAAAAAAAAAAvAQAAX3JlbHMv LnJlbHNQSwECLQAUAAYACAAAACEAuMDWIFwCAAAHBQAADgAAAAAAAAAAAAAAAAAuAgAAZHJzL2Uy b0RvYy54bWxQSwECLQAUAAYACAAAACEA31fnBuQAAAARAQAADwAAAAAAAAAAAAAAAAC2BAAAZHJz L2Rvd25yZXYueG1sUEsFBgAAAAAEAAQA8wAAAMcFAAAAAA== " fillcolor="black [3200]" strokecolor="black [480]" strokeweight="1pt">
                 <w10:wrap anchory="page"/>
               </v:rect>
             </w:pict>
@@ -2190,19 +2172,7 @@
         <w:rPr>
           <w:rFonts w:ascii="Times New Roman" w:hAnsi="Times New Roman" w:cs="Times New Roman"/>
         </w:rPr>
-        <w:t>Executive Summary</w:t>
-      </w:r>
-      <w:r>
-        <w:rPr>
-          <w:rFonts w:ascii="Times New Roman" w:hAnsi="Times New Roman" w:cs="Times New Roman"/>
-        </w:rPr>
-        <w:t xml:space="preserve"> ……………………………………………………………...………… 0</w:t>
-      </w:r>
-      <w:r>
-        <w:rPr>
-          <w:rFonts w:ascii="Times New Roman" w:hAnsi="Times New Roman" w:cs="Times New Roman"/>
-        </w:rPr>
-        <w:t>5</w:t>
+        <w:t>Executive Summary ……………………………………………………………...………… 05</w:t>
       </w:r>
     </w:p>
     <w:p>
@@ -2222,128 +2192,50 @@
         <w:rPr>
           <w:rFonts w:ascii="Times New Roman" w:hAnsi="Times New Roman" w:cs="Times New Roman"/>
         </w:rPr>
-        <w:t>…………………………………………………………</w:t>
+        <w:t>……………………………………………………………..………… 06</w:t>
       </w:r>
-      <w:proofErr w:type="gramStart"/>
+    </w:p>
+    <w:p>
+      <w:pPr>
+        <w:spacing w:line="360" w:lineRule="auto"/>
+        <w:rPr>
+          <w:rFonts w:ascii="Times New Roman" w:hAnsi="Times New Roman" w:cs="Times New Roman"/>
+        </w:rPr>
+      </w:pPr>
       <w:r>
         <w:rPr>
           <w:rFonts w:ascii="Times New Roman" w:hAnsi="Times New Roman" w:cs="Times New Roman"/>
         </w:rPr>
-        <w:t>…..</w:t>
+        <w:t>1. Purpose ………………………….……………………………………………..………… 09</w:t>
       </w:r>
-      <w:proofErr w:type="gramEnd"/>
+    </w:p>
+    <w:p>
+      <w:pPr>
+        <w:spacing w:line="360" w:lineRule="auto"/>
+        <w:rPr>
+          <w:rFonts w:ascii="Times New Roman" w:hAnsi="Times New Roman" w:cs="Times New Roman"/>
+        </w:rPr>
+      </w:pPr>
       <w:r>
         <w:rPr>
           <w:rFonts w:ascii="Times New Roman" w:hAnsi="Times New Roman" w:cs="Times New Roman"/>
         </w:rPr>
-        <w:t>………… 0</w:t>
+        <w:t>2. Scope ………………………….……………………………………………..………...… 10</w:t>
       </w:r>
+    </w:p>
+    <w:p>
+      <w:pPr>
+        <w:spacing w:line="360" w:lineRule="auto"/>
+        <w:rPr>
+          <w:rFonts w:ascii="Times New Roman" w:hAnsi="Times New Roman" w:cs="Times New Roman"/>
+        </w:rPr>
+      </w:pPr>
       <w:r>
         <w:rPr>
           <w:rFonts w:ascii="Times New Roman" w:hAnsi="Times New Roman" w:cs="Times New Roman"/>
         </w:rPr>
-        <w:t>6</w:t>
-      </w:r>
-    </w:p>
-    <w:p>
-      <w:pPr>
-        <w:spacing w:line="360" w:lineRule="auto"/>
-        <w:rPr>
-          <w:rFonts w:ascii="Times New Roman" w:hAnsi="Times New Roman" w:cs="Times New Roman"/>
-        </w:rPr>
-      </w:pPr>
-      <w:r>
-        <w:rPr>
-          <w:rFonts w:ascii="Times New Roman" w:hAnsi="Times New Roman" w:cs="Times New Roman"/>
-        </w:rPr>
-        <w:t xml:space="preserve">1. </w:t>
-      </w:r>
-      <w:r>
-        <w:rPr>
-          <w:rFonts w:ascii="Times New Roman" w:hAnsi="Times New Roman" w:cs="Times New Roman"/>
-        </w:rPr>
-        <w:t>Purpose ………………………….…………………………………………</w:t>
-      </w:r>
-      <w:proofErr w:type="gramStart"/>
-      <w:r>
-        <w:rPr>
-          <w:rFonts w:ascii="Times New Roman" w:hAnsi="Times New Roman" w:cs="Times New Roman"/>
-        </w:rPr>
-        <w:t>…..</w:t>
-      </w:r>
-      <w:proofErr w:type="gramEnd"/>
-      <w:r>
-        <w:rPr>
-          <w:rFonts w:ascii="Times New Roman" w:hAnsi="Times New Roman" w:cs="Times New Roman"/>
-        </w:rPr>
-        <w:t>………… 0</w:t>
-      </w:r>
-      <w:r>
-        <w:rPr>
-          <w:rFonts w:ascii="Times New Roman" w:hAnsi="Times New Roman" w:cs="Times New Roman"/>
-        </w:rPr>
-        <w:t>9</w:t>
-      </w:r>
-    </w:p>
-    <w:p>
-      <w:pPr>
-        <w:spacing w:line="360" w:lineRule="auto"/>
-        <w:rPr>
-          <w:rFonts w:ascii="Times New Roman" w:hAnsi="Times New Roman" w:cs="Times New Roman"/>
-        </w:rPr>
-      </w:pPr>
-      <w:r>
-        <w:rPr>
-          <w:rFonts w:ascii="Times New Roman" w:hAnsi="Times New Roman" w:cs="Times New Roman"/>
-        </w:rPr>
-        <w:t xml:space="preserve">2. </w:t>
-      </w:r>
-      <w:r>
-        <w:rPr>
-          <w:rFonts w:ascii="Times New Roman" w:hAnsi="Times New Roman" w:cs="Times New Roman"/>
-        </w:rPr>
-        <w:t>Scope ………………………….…………………………………………</w:t>
-      </w:r>
-      <w:proofErr w:type="gramStart"/>
-      <w:r>
-        <w:rPr>
-          <w:rFonts w:ascii="Times New Roman" w:hAnsi="Times New Roman" w:cs="Times New Roman"/>
-        </w:rPr>
-        <w:t>…..</w:t>
-      </w:r>
-      <w:proofErr w:type="gramEnd"/>
-      <w:r>
-        <w:rPr>
-          <w:rFonts w:ascii="Times New Roman" w:hAnsi="Times New Roman" w:cs="Times New Roman"/>
-        </w:rPr>
-        <w:t xml:space="preserve">………...… </w:t>
-      </w:r>
-      <w:r>
-        <w:rPr>
-          <w:rFonts w:ascii="Times New Roman" w:hAnsi="Times New Roman" w:cs="Times New Roman"/>
-        </w:rPr>
-        <w:t>10</w:t>
-      </w:r>
-    </w:p>
-    <w:p>
-      <w:pPr>
-        <w:spacing w:line="360" w:lineRule="auto"/>
-        <w:rPr>
-          <w:rFonts w:ascii="Times New Roman" w:hAnsi="Times New Roman" w:cs="Times New Roman"/>
-        </w:rPr>
-      </w:pPr>
-      <w:r>
-        <w:rPr>
-          <w:rFonts w:ascii="Times New Roman" w:hAnsi="Times New Roman" w:cs="Times New Roman"/>
-        </w:rPr>
         <w:tab/>
-        <w:t xml:space="preserve">2.1 In Scope …….…………………………………………………………………... </w:t>
-      </w:r>
-      <w:r>
-        <w:rPr>
-          <w:rFonts w:ascii="Times New Roman" w:hAnsi="Times New Roman" w:cs="Times New Roman"/>
-        </w:rPr>
-        <w:t>10</w:t>
+        <w:t>2.1 In Scope …….…………………………………………………………………... 10</w:t>
       </w:r>
     </w:p>
     <w:p>
@@ -2358,27 +2250,7 @@
         <w:rPr>
           <w:rFonts w:ascii="Times New Roman" w:hAnsi="Times New Roman" w:cs="Times New Roman"/>
         </w:rPr>
-        <w:t>2.2 Out of Scope ………………………………………………………...………</w:t>
-      </w:r>
-      <w:proofErr w:type="gramStart"/>
-      <w:r>
-        <w:rPr>
-          <w:rFonts w:ascii="Times New Roman" w:hAnsi="Times New Roman" w:cs="Times New Roman"/>
-        </w:rPr>
-        <w:t>…..</w:t>
-      </w:r>
-      <w:proofErr w:type="gramEnd"/>
-      <w:r>
-        <w:rPr>
-          <w:rFonts w:ascii="Times New Roman" w:hAnsi="Times New Roman" w:cs="Times New Roman"/>
-        </w:rPr>
-        <w:t xml:space="preserve"> </w:t>
-      </w:r>
-      <w:r>
-        <w:rPr>
-          <w:rFonts w:ascii="Times New Roman" w:hAnsi="Times New Roman" w:cs="Times New Roman"/>
-        </w:rPr>
-        <w:t>10</w:t>
+        <w:t>2.2 Out of Scope ………………………………………………………...………….. 10</w:t>
       </w:r>
     </w:p>
     <w:p>
@@ -2393,53 +2265,21 @@
         <w:rPr>
           <w:rFonts w:ascii="Times New Roman" w:hAnsi="Times New Roman" w:cs="Times New Roman"/>
         </w:rPr>
-        <w:t>2.3 Assumptions and Constraints ……………………</w:t>
+        <w:t>2.3 Assumptions and Constraints ………………………..……………...………….. 11</w:t>
       </w:r>
-      <w:proofErr w:type="gramStart"/>
+    </w:p>
+    <w:p>
+      <w:pPr>
+        <w:spacing w:line="360" w:lineRule="auto"/>
+        <w:rPr>
+          <w:rFonts w:ascii="Times New Roman" w:hAnsi="Times New Roman" w:cs="Times New Roman"/>
+        </w:rPr>
+      </w:pPr>
       <w:r>
         <w:rPr>
           <w:rFonts w:ascii="Times New Roman" w:hAnsi="Times New Roman" w:cs="Times New Roman"/>
         </w:rPr>
-        <w:t>…..</w:t>
-      </w:r>
-      <w:proofErr w:type="gramEnd"/>
-      <w:r>
-        <w:rPr>
-          <w:rFonts w:ascii="Times New Roman" w:hAnsi="Times New Roman" w:cs="Times New Roman"/>
-        </w:rPr>
-        <w:t xml:space="preserve">……………...………….. </w:t>
-      </w:r>
-      <w:r>
-        <w:rPr>
-          <w:rFonts w:ascii="Times New Roman" w:hAnsi="Times New Roman" w:cs="Times New Roman"/>
-        </w:rPr>
-        <w:t>11</w:t>
-      </w:r>
-    </w:p>
-    <w:p>
-      <w:pPr>
-        <w:spacing w:line="360" w:lineRule="auto"/>
-        <w:rPr>
-          <w:rFonts w:ascii="Times New Roman" w:hAnsi="Times New Roman" w:cs="Times New Roman"/>
-        </w:rPr>
-      </w:pPr>
-      <w:r>
-        <w:rPr>
-          <w:rFonts w:ascii="Times New Roman" w:hAnsi="Times New Roman" w:cs="Times New Roman"/>
-        </w:rPr>
-        <w:t xml:space="preserve">3. </w:t>
-      </w:r>
-      <w:r>
-        <w:rPr>
-          <w:rFonts w:ascii="Times New Roman" w:hAnsi="Times New Roman" w:cs="Times New Roman"/>
-        </w:rPr>
-        <w:t xml:space="preserve">Audit Criteria and Methodology ………………………….……………………...……… </w:t>
-      </w:r>
-      <w:r>
-        <w:rPr>
-          <w:rFonts w:ascii="Times New Roman" w:hAnsi="Times New Roman" w:cs="Times New Roman"/>
-        </w:rPr>
-        <w:t>12</w:t>
+        <w:t>3. Audit Criteria and Methodology ………………………….……………………...……… 12</w:t>
       </w:r>
     </w:p>
     <w:p>
@@ -2454,27 +2294,7 @@
         <w:rPr>
           <w:rFonts w:ascii="Times New Roman" w:hAnsi="Times New Roman" w:cs="Times New Roman"/>
         </w:rPr>
-        <w:t>3.1 Audit Criteria …………………...............…………………………...………</w:t>
-      </w:r>
-      <w:proofErr w:type="gramStart"/>
-      <w:r>
-        <w:rPr>
-          <w:rFonts w:ascii="Times New Roman" w:hAnsi="Times New Roman" w:cs="Times New Roman"/>
-        </w:rPr>
-        <w:t>…..</w:t>
-      </w:r>
-      <w:proofErr w:type="gramEnd"/>
-      <w:r>
-        <w:rPr>
-          <w:rFonts w:ascii="Times New Roman" w:hAnsi="Times New Roman" w:cs="Times New Roman"/>
-        </w:rPr>
-        <w:t xml:space="preserve"> </w:t>
-      </w:r>
-      <w:r>
-        <w:rPr>
-          <w:rFonts w:ascii="Times New Roman" w:hAnsi="Times New Roman" w:cs="Times New Roman"/>
-        </w:rPr>
-        <w:t>12</w:t>
+        <w:t>3.1 Audit Criteria …………………...............…………………………...………….. 12</w:t>
       </w:r>
     </w:p>
     <w:p>
@@ -2489,27 +2309,7 @@
         <w:rPr>
           <w:rFonts w:ascii="Times New Roman" w:hAnsi="Times New Roman" w:cs="Times New Roman"/>
         </w:rPr>
-        <w:t>3.2 Method of Assessment …………………...………….……………...………</w:t>
-      </w:r>
-      <w:proofErr w:type="gramStart"/>
-      <w:r>
-        <w:rPr>
-          <w:rFonts w:ascii="Times New Roman" w:hAnsi="Times New Roman" w:cs="Times New Roman"/>
-        </w:rPr>
-        <w:t>…..</w:t>
-      </w:r>
-      <w:proofErr w:type="gramEnd"/>
-      <w:r>
-        <w:rPr>
-          <w:rFonts w:ascii="Times New Roman" w:hAnsi="Times New Roman" w:cs="Times New Roman"/>
-        </w:rPr>
-        <w:t xml:space="preserve"> </w:t>
-      </w:r>
-      <w:r>
-        <w:rPr>
-          <w:rFonts w:ascii="Times New Roman" w:hAnsi="Times New Roman" w:cs="Times New Roman"/>
-        </w:rPr>
-        <w:t>12</w:t>
+        <w:t>3.2 Method of Assessment …………………...………….……………...………….. 12</w:t>
       </w:r>
     </w:p>
     <w:p>
@@ -2524,71 +2324,21 @@
         <w:rPr>
           <w:rFonts w:ascii="Times New Roman" w:hAnsi="Times New Roman" w:cs="Times New Roman"/>
         </w:rPr>
-        <w:t>3.3 Evidence of Sources ………………</w:t>
+        <w:t>3.3 Evidence of Sources ……………….…...…...……….……………...………….. 12</w:t>
       </w:r>
+    </w:p>
+    <w:p>
+      <w:pPr>
+        <w:spacing w:line="360" w:lineRule="auto"/>
+        <w:rPr>
+          <w:rFonts w:ascii="Times New Roman" w:hAnsi="Times New Roman" w:cs="Times New Roman"/>
+        </w:rPr>
+      </w:pPr>
       <w:r>
         <w:rPr>
           <w:rFonts w:ascii="Times New Roman" w:hAnsi="Times New Roman" w:cs="Times New Roman"/>
         </w:rPr>
-        <w:t>.</w:t>
-      </w:r>
-      <w:r>
-        <w:rPr>
-          <w:rFonts w:ascii="Times New Roman" w:hAnsi="Times New Roman" w:cs="Times New Roman"/>
-        </w:rPr>
-        <w:t>…...…...……….……………...………</w:t>
-      </w:r>
-      <w:proofErr w:type="gramStart"/>
-      <w:r>
-        <w:rPr>
-          <w:rFonts w:ascii="Times New Roman" w:hAnsi="Times New Roman" w:cs="Times New Roman"/>
-        </w:rPr>
-        <w:t>…..</w:t>
-      </w:r>
-      <w:proofErr w:type="gramEnd"/>
-      <w:r>
-        <w:rPr>
-          <w:rFonts w:ascii="Times New Roman" w:hAnsi="Times New Roman" w:cs="Times New Roman"/>
-        </w:rPr>
-        <w:t xml:space="preserve"> </w:t>
-      </w:r>
-      <w:r>
-        <w:rPr>
-          <w:rFonts w:ascii="Times New Roman" w:hAnsi="Times New Roman" w:cs="Times New Roman"/>
-        </w:rPr>
-        <w:t>12</w:t>
-      </w:r>
-    </w:p>
-    <w:p>
-      <w:pPr>
-        <w:spacing w:line="360" w:lineRule="auto"/>
-        <w:rPr>
-          <w:rFonts w:ascii="Times New Roman" w:hAnsi="Times New Roman" w:cs="Times New Roman"/>
-        </w:rPr>
-      </w:pPr>
-      <w:r>
-        <w:rPr>
-          <w:rFonts w:ascii="Times New Roman" w:hAnsi="Times New Roman" w:cs="Times New Roman"/>
-        </w:rPr>
-        <w:t xml:space="preserve">4. </w:t>
-      </w:r>
-      <w:r>
-        <w:rPr>
-          <w:rFonts w:ascii="Times New Roman" w:hAnsi="Times New Roman" w:cs="Times New Roman"/>
-        </w:rPr>
-        <w:t xml:space="preserve">Compliance Summary ………………………….……………………...………………… </w:t>
-      </w:r>
-      <w:r>
-        <w:rPr>
-          <w:rFonts w:ascii="Times New Roman" w:hAnsi="Times New Roman" w:cs="Times New Roman"/>
-        </w:rPr>
-        <w:t>1</w:t>
-      </w:r>
-      <w:r>
-        <w:rPr>
-          <w:rFonts w:ascii="Times New Roman" w:hAnsi="Times New Roman" w:cs="Times New Roman"/>
-        </w:rPr>
-        <w:t>3</w:t>
+        <w:t>4. Compliance Summary ………………………….……………………...………………… 13</w:t>
       </w:r>
     </w:p>
     <w:p>
@@ -2603,45 +2353,7 @@
         <w:rPr>
           <w:rFonts w:ascii="Times New Roman" w:hAnsi="Times New Roman" w:cs="Times New Roman"/>
         </w:rPr>
-        <w:t>4.1 Rating Definitions ……………...............…………………………</w:t>
-      </w:r>
-      <w:r>
-        <w:rPr>
-          <w:rFonts w:ascii="Times New Roman" w:hAnsi="Times New Roman" w:cs="Times New Roman"/>
-        </w:rPr>
-        <w:t>.</w:t>
-      </w:r>
-      <w:r>
-        <w:rPr>
-          <w:rFonts w:ascii="Times New Roman" w:hAnsi="Times New Roman" w:cs="Times New Roman"/>
-        </w:rPr>
-        <w:t>..………</w:t>
-      </w:r>
-      <w:proofErr w:type="gramStart"/>
-      <w:r>
-        <w:rPr>
-          <w:rFonts w:ascii="Times New Roman" w:hAnsi="Times New Roman" w:cs="Times New Roman"/>
-        </w:rPr>
-        <w:t>…..</w:t>
-      </w:r>
-      <w:proofErr w:type="gramEnd"/>
-      <w:r>
-        <w:rPr>
-          <w:rFonts w:ascii="Times New Roman" w:hAnsi="Times New Roman" w:cs="Times New Roman"/>
-        </w:rPr>
-        <w:t xml:space="preserve"> </w:t>
-      </w:r>
-      <w:r>
-        <w:rPr>
-          <w:rFonts w:ascii="Times New Roman" w:hAnsi="Times New Roman" w:cs="Times New Roman"/>
-        </w:rPr>
-        <w:t>1</w:t>
-      </w:r>
-      <w:r>
-        <w:rPr>
-          <w:rFonts w:ascii="Times New Roman" w:hAnsi="Times New Roman" w:cs="Times New Roman"/>
-        </w:rPr>
-        <w:t>3</w:t>
+        <w:t>4.1 Rating Definitions ……………...............…………………………...………….. 13</w:t>
       </w:r>
     </w:p>
     <w:p>
@@ -2656,63 +2368,7 @@
         <w:rPr>
           <w:rFonts w:ascii="Times New Roman" w:hAnsi="Times New Roman" w:cs="Times New Roman"/>
         </w:rPr>
-        <w:t>4</w:t>
-      </w:r>
-      <w:r>
-        <w:rPr>
-          <w:rFonts w:ascii="Times New Roman" w:hAnsi="Times New Roman" w:cs="Times New Roman"/>
-        </w:rPr>
-        <w:t xml:space="preserve">.2 </w:t>
-      </w:r>
-      <w:r>
-        <w:rPr>
-          <w:rFonts w:ascii="Times New Roman" w:hAnsi="Times New Roman" w:cs="Times New Roman"/>
-        </w:rPr>
-        <w:t>Domain / Control Family Summary</w:t>
-      </w:r>
-      <w:r>
-        <w:rPr>
-          <w:rFonts w:ascii="Times New Roman" w:hAnsi="Times New Roman" w:cs="Times New Roman"/>
-        </w:rPr>
-        <w:t xml:space="preserve"> …………………...………….…</w:t>
-      </w:r>
-      <w:r>
-        <w:rPr>
-          <w:rFonts w:ascii="Times New Roman" w:hAnsi="Times New Roman" w:cs="Times New Roman"/>
-        </w:rPr>
-        <w:t>...</w:t>
-      </w:r>
-      <w:r>
-        <w:rPr>
-          <w:rFonts w:ascii="Times New Roman" w:hAnsi="Times New Roman" w:cs="Times New Roman"/>
-        </w:rPr>
-        <w:t>……</w:t>
-      </w:r>
-      <w:proofErr w:type="gramStart"/>
-      <w:r>
-        <w:rPr>
-          <w:rFonts w:ascii="Times New Roman" w:hAnsi="Times New Roman" w:cs="Times New Roman"/>
-        </w:rPr>
-        <w:t>…..</w:t>
-      </w:r>
-      <w:proofErr w:type="gramEnd"/>
-      <w:r>
-        <w:rPr>
-          <w:rFonts w:ascii="Times New Roman" w:hAnsi="Times New Roman" w:cs="Times New Roman"/>
-        </w:rPr>
-        <w:t xml:space="preserve"> </w:t>
-      </w:r>
-      <w:r>
-        <w:rPr>
-          <w:rFonts w:ascii="Times New Roman" w:hAnsi="Times New Roman" w:cs="Times New Roman"/>
-        </w:rPr>
-        <w:t>1</w:t>
-      </w:r>
-      <w:r>
-        <w:rPr>
-          <w:rFonts w:ascii="Times New Roman" w:hAnsi="Times New Roman" w:cs="Times New Roman"/>
-        </w:rPr>
-        <w:t>3</w:t>
+        <w:t>4.2 Domain / Control Family Summary …………………...………….…...……….. 13</w:t>
       </w:r>
     </w:p>
     <w:p>
@@ -2727,133 +2383,35 @@
         <w:rPr>
           <w:rFonts w:ascii="Times New Roman" w:hAnsi="Times New Roman" w:cs="Times New Roman"/>
         </w:rPr>
-        <w:t>4</w:t>
+        <w:t>4.3 Finding Severity Summary ……..….…...…...……….……………...………….. 14</w:t>
       </w:r>
+    </w:p>
+    <w:p>
+      <w:pPr>
+        <w:spacing w:line="360" w:lineRule="auto"/>
+        <w:rPr>
+          <w:rFonts w:ascii="Times New Roman" w:hAnsi="Times New Roman" w:cs="Times New Roman"/>
+        </w:rPr>
+      </w:pPr>
       <w:r>
         <w:rPr>
           <w:rFonts w:ascii="Times New Roman" w:hAnsi="Times New Roman" w:cs="Times New Roman"/>
         </w:rPr>
-        <w:t xml:space="preserve">.3 </w:t>
+        <w:t>5. Areas of Strength ………………………………………….……………………...……… 15</w:t>
       </w:r>
+    </w:p>
+    <w:p>
+      <w:pPr>
+        <w:spacing w:line="360" w:lineRule="auto"/>
+        <w:rPr>
+          <w:rFonts w:ascii="Times New Roman" w:hAnsi="Times New Roman" w:cs="Times New Roman"/>
+        </w:rPr>
+      </w:pPr>
       <w:r>
         <w:rPr>
           <w:rFonts w:ascii="Times New Roman" w:hAnsi="Times New Roman" w:cs="Times New Roman"/>
         </w:rPr>
-        <w:t xml:space="preserve">Finding Severity Summary </w:t>
-      </w:r>
-      <w:r>
-        <w:rPr>
-          <w:rFonts w:ascii="Times New Roman" w:hAnsi="Times New Roman" w:cs="Times New Roman"/>
-        </w:rPr>
-        <w:t>…</w:t>
-      </w:r>
-      <w:proofErr w:type="gramStart"/>
-      <w:r>
-        <w:rPr>
-          <w:rFonts w:ascii="Times New Roman" w:hAnsi="Times New Roman" w:cs="Times New Roman"/>
-        </w:rPr>
-        <w:t>…..</w:t>
-      </w:r>
-      <w:proofErr w:type="gramEnd"/>
-      <w:r>
-        <w:rPr>
-          <w:rFonts w:ascii="Times New Roman" w:hAnsi="Times New Roman" w:cs="Times New Roman"/>
-        </w:rPr>
-        <w:t xml:space="preserve">….…...…...……….……………...………….. </w:t>
-      </w:r>
-      <w:r>
-        <w:rPr>
-          <w:rFonts w:ascii="Times New Roman" w:hAnsi="Times New Roman" w:cs="Times New Roman"/>
-        </w:rPr>
-        <w:t>1</w:t>
-      </w:r>
-      <w:r>
-        <w:rPr>
-          <w:rFonts w:ascii="Times New Roman" w:hAnsi="Times New Roman" w:cs="Times New Roman"/>
-        </w:rPr>
-        <w:t>4</w:t>
-      </w:r>
-    </w:p>
-    <w:p>
-      <w:pPr>
-        <w:spacing w:line="360" w:lineRule="auto"/>
-        <w:rPr>
-          <w:rFonts w:ascii="Times New Roman" w:hAnsi="Times New Roman" w:cs="Times New Roman"/>
-        </w:rPr>
-      </w:pPr>
-      <w:r>
-        <w:rPr>
-          <w:rFonts w:ascii="Times New Roman" w:hAnsi="Times New Roman" w:cs="Times New Roman"/>
-        </w:rPr>
-        <w:t xml:space="preserve">5. </w:t>
-      </w:r>
-      <w:r>
-        <w:rPr>
-          <w:rFonts w:ascii="Times New Roman" w:hAnsi="Times New Roman" w:cs="Times New Roman"/>
-        </w:rPr>
-        <w:t>Areas of Strength ………………………………………….………………</w:t>
-      </w:r>
-      <w:r>
-        <w:rPr>
-          <w:rFonts w:ascii="Times New Roman" w:hAnsi="Times New Roman" w:cs="Times New Roman"/>
-        </w:rPr>
-        <w:t>…</w:t>
-      </w:r>
-      <w:r>
-        <w:rPr>
-          <w:rFonts w:ascii="Times New Roman" w:hAnsi="Times New Roman" w:cs="Times New Roman"/>
-        </w:rPr>
-        <w:t xml:space="preserve">…...……… </w:t>
-      </w:r>
-      <w:r>
-        <w:rPr>
-          <w:rFonts w:ascii="Times New Roman" w:hAnsi="Times New Roman" w:cs="Times New Roman"/>
-        </w:rPr>
-        <w:t>1</w:t>
-      </w:r>
-      <w:r>
-        <w:rPr>
-          <w:rFonts w:ascii="Times New Roman" w:hAnsi="Times New Roman" w:cs="Times New Roman"/>
-        </w:rPr>
-        <w:t>5</w:t>
-      </w:r>
-    </w:p>
-    <w:p>
-      <w:pPr>
-        <w:spacing w:line="360" w:lineRule="auto"/>
-        <w:rPr>
-          <w:rFonts w:ascii="Times New Roman" w:hAnsi="Times New Roman" w:cs="Times New Roman"/>
-        </w:rPr>
-      </w:pPr>
-      <w:r>
-        <w:rPr>
-          <w:rFonts w:ascii="Times New Roman" w:hAnsi="Times New Roman" w:cs="Times New Roman"/>
-        </w:rPr>
-        <w:t xml:space="preserve">6. </w:t>
-      </w:r>
-      <w:r>
-        <w:rPr>
-          <w:rFonts w:ascii="Times New Roman" w:hAnsi="Times New Roman" w:cs="Times New Roman"/>
-        </w:rPr>
-        <w:t>Detailed Findings ………………………………………….………………</w:t>
-      </w:r>
-      <w:r>
-        <w:rPr>
-          <w:rFonts w:ascii="Times New Roman" w:hAnsi="Times New Roman" w:cs="Times New Roman"/>
-        </w:rPr>
-        <w:t>…</w:t>
-      </w:r>
-      <w:r>
-        <w:rPr>
-          <w:rFonts w:ascii="Times New Roman" w:hAnsi="Times New Roman" w:cs="Times New Roman"/>
-        </w:rPr>
-        <w:t>…...…...… 1</w:t>
-      </w:r>
-      <w:r>
-        <w:rPr>
-          <w:rFonts w:ascii="Times New Roman" w:hAnsi="Times New Roman" w:cs="Times New Roman"/>
-        </w:rPr>
-        <w:t>6</w:t>
+        <w:t>6. Detailed Findings ………………………………………….……………………...…...… 16</w:t>
       </w:r>
     </w:p>
     <w:p>
@@ -2868,27 +2426,7 @@
         <w:rPr>
           <w:rFonts w:ascii="Times New Roman" w:hAnsi="Times New Roman" w:cs="Times New Roman"/>
         </w:rPr>
-        <w:t>6.1 Control Name ……………...............……………...………………...………</w:t>
-      </w:r>
-      <w:proofErr w:type="gramStart"/>
-      <w:r>
-        <w:rPr>
-          <w:rFonts w:ascii="Times New Roman" w:hAnsi="Times New Roman" w:cs="Times New Roman"/>
-        </w:rPr>
-        <w:t>…..</w:t>
-      </w:r>
-      <w:proofErr w:type="gramEnd"/>
-      <w:r>
-        <w:rPr>
-          <w:rFonts w:ascii="Times New Roman" w:hAnsi="Times New Roman" w:cs="Times New Roman"/>
-        </w:rPr>
-        <w:t xml:space="preserve"> 1</w:t>
-      </w:r>
-      <w:r>
-        <w:rPr>
-          <w:rFonts w:ascii="Times New Roman" w:hAnsi="Times New Roman" w:cs="Times New Roman"/>
-        </w:rPr>
-        <w:t>6</w:t>
+        <w:t>6.1 Control Name ……………...............……………...………………...………….. 16</w:t>
       </w:r>
     </w:p>
     <w:p>
@@ -2903,27 +2441,7 @@
         <w:rPr>
           <w:rFonts w:ascii="Times New Roman" w:hAnsi="Times New Roman" w:cs="Times New Roman"/>
         </w:rPr>
-        <w:t>6.2 Control Name ……………...............……………...………………...………</w:t>
-      </w:r>
-      <w:proofErr w:type="gramStart"/>
-      <w:r>
-        <w:rPr>
-          <w:rFonts w:ascii="Times New Roman" w:hAnsi="Times New Roman" w:cs="Times New Roman"/>
-        </w:rPr>
-        <w:t>…..</w:t>
-      </w:r>
-      <w:proofErr w:type="gramEnd"/>
-      <w:r>
-        <w:rPr>
-          <w:rFonts w:ascii="Times New Roman" w:hAnsi="Times New Roman" w:cs="Times New Roman"/>
-        </w:rPr>
-        <w:t xml:space="preserve"> 1</w:t>
-      </w:r>
-      <w:r>
-        <w:rPr>
-          <w:rFonts w:ascii="Times New Roman" w:hAnsi="Times New Roman" w:cs="Times New Roman"/>
-        </w:rPr>
-        <w:t>7</w:t>
+        <w:t>6.2 Control Name ……………...............……………...………………...………….. 17</w:t>
       </w:r>
     </w:p>
     <w:p>
@@ -2938,27 +2456,7 @@
         <w:rPr>
           <w:rFonts w:ascii="Times New Roman" w:hAnsi="Times New Roman" w:cs="Times New Roman"/>
         </w:rPr>
-        <w:t>6.3 Control Name ……………...............……………...………………...………</w:t>
-      </w:r>
-      <w:proofErr w:type="gramStart"/>
-      <w:r>
-        <w:rPr>
-          <w:rFonts w:ascii="Times New Roman" w:hAnsi="Times New Roman" w:cs="Times New Roman"/>
-        </w:rPr>
-        <w:t>…..</w:t>
-      </w:r>
-      <w:proofErr w:type="gramEnd"/>
-      <w:r>
-        <w:rPr>
-          <w:rFonts w:ascii="Times New Roman" w:hAnsi="Times New Roman" w:cs="Times New Roman"/>
-        </w:rPr>
-        <w:t xml:space="preserve"> 1</w:t>
-      </w:r>
-      <w:r>
-        <w:rPr>
-          <w:rFonts w:ascii="Times New Roman" w:hAnsi="Times New Roman" w:cs="Times New Roman"/>
-        </w:rPr>
-        <w:t>8</w:t>
+        <w:t>6.3 Control Name ……………...............……………...………………...………….. 18</w:t>
       </w:r>
     </w:p>
     <w:p>
@@ -2973,67 +2471,21 @@
         <w:rPr>
           <w:rFonts w:ascii="Times New Roman" w:hAnsi="Times New Roman" w:cs="Times New Roman"/>
         </w:rPr>
-        <w:t>6.4 Control Name ……………...............……………...………………...………</w:t>
+        <w:t>6.4 Control Name ……………...............……………...………………...………….. 19</w:t>
       </w:r>
-      <w:proofErr w:type="gramStart"/>
+    </w:p>
+    <w:p>
+      <w:pPr>
+        <w:spacing w:line="360" w:lineRule="auto"/>
+        <w:rPr>
+          <w:rFonts w:ascii="Times New Roman" w:hAnsi="Times New Roman" w:cs="Times New Roman"/>
+        </w:rPr>
+      </w:pPr>
       <w:r>
         <w:rPr>
           <w:rFonts w:ascii="Times New Roman" w:hAnsi="Times New Roman" w:cs="Times New Roman"/>
         </w:rPr>
-        <w:t>…..</w:t>
-      </w:r>
-      <w:proofErr w:type="gramEnd"/>
-      <w:r>
-        <w:rPr>
-          <w:rFonts w:ascii="Times New Roman" w:hAnsi="Times New Roman" w:cs="Times New Roman"/>
-        </w:rPr>
-        <w:t xml:space="preserve"> 1</w:t>
-      </w:r>
-      <w:r>
-        <w:rPr>
-          <w:rFonts w:ascii="Times New Roman" w:hAnsi="Times New Roman" w:cs="Times New Roman"/>
-        </w:rPr>
-        <w:t>9</w:t>
-      </w:r>
-    </w:p>
-    <w:p>
-      <w:pPr>
-        <w:spacing w:line="360" w:lineRule="auto"/>
-        <w:rPr>
-          <w:rFonts w:ascii="Times New Roman" w:hAnsi="Times New Roman" w:cs="Times New Roman"/>
-        </w:rPr>
-      </w:pPr>
-      <w:r>
-        <w:rPr>
-          <w:rFonts w:ascii="Times New Roman" w:hAnsi="Times New Roman" w:cs="Times New Roman"/>
-        </w:rPr>
-        <w:t xml:space="preserve">7. </w:t>
-      </w:r>
-      <w:r>
-        <w:rPr>
-          <w:rFonts w:ascii="Times New Roman" w:hAnsi="Times New Roman" w:cs="Times New Roman"/>
-        </w:rPr>
-        <w:t>Recommendations and Remediation Plan ………………………………………</w:t>
-      </w:r>
-      <w:proofErr w:type="gramStart"/>
-      <w:r>
-        <w:rPr>
-          <w:rFonts w:ascii="Times New Roman" w:hAnsi="Times New Roman" w:cs="Times New Roman"/>
-        </w:rPr>
-        <w:t>…..</w:t>
-      </w:r>
-      <w:proofErr w:type="gramEnd"/>
-      <w:r>
-        <w:rPr>
-          <w:rFonts w:ascii="Times New Roman" w:hAnsi="Times New Roman" w:cs="Times New Roman"/>
-        </w:rPr>
-        <w:t xml:space="preserve">…… </w:t>
-      </w:r>
-      <w:r>
-        <w:rPr>
-          <w:rFonts w:ascii="Times New Roman" w:hAnsi="Times New Roman" w:cs="Times New Roman"/>
-        </w:rPr>
-        <w:t>20</w:t>
+        <w:t>7. Recommendations and Remediation Plan …………………………………………..…… 20</w:t>
       </w:r>
     </w:p>
     <w:p>
@@ -3048,39 +2500,7 @@
         <w:rPr>
           <w:rFonts w:ascii="Times New Roman" w:hAnsi="Times New Roman" w:cs="Times New Roman"/>
         </w:rPr>
-        <w:t>7.1 Prioritised Actions ……………...............………...…………</w:t>
-      </w:r>
-      <w:r>
-        <w:rPr>
-          <w:rFonts w:ascii="Times New Roman" w:hAnsi="Times New Roman" w:cs="Times New Roman"/>
-        </w:rPr>
-        <w:t>.</w:t>
-      </w:r>
-      <w:r>
-        <w:rPr>
-          <w:rFonts w:ascii="Times New Roman" w:hAnsi="Times New Roman" w:cs="Times New Roman"/>
-        </w:rPr>
-        <w:t>……...………</w:t>
-      </w:r>
-      <w:proofErr w:type="gramStart"/>
-      <w:r>
-        <w:rPr>
-          <w:rFonts w:ascii="Times New Roman" w:hAnsi="Times New Roman" w:cs="Times New Roman"/>
-        </w:rPr>
-        <w:t>…..</w:t>
-      </w:r>
-      <w:proofErr w:type="gramEnd"/>
-      <w:r>
-        <w:rPr>
-          <w:rFonts w:ascii="Times New Roman" w:hAnsi="Times New Roman" w:cs="Times New Roman"/>
-        </w:rPr>
-        <w:t xml:space="preserve"> </w:t>
-      </w:r>
-      <w:r>
-        <w:rPr>
-          <w:rFonts w:ascii="Times New Roman" w:hAnsi="Times New Roman" w:cs="Times New Roman"/>
-        </w:rPr>
-        <w:t>20</w:t>
+        <w:t>7.1 Prioritised Actions ……………...............………...………….……...………….. 20</w:t>
       </w:r>
     </w:p>
     <w:p>
@@ -3118,129 +2538,49 @@
         <w:rPr>
           <w:rFonts w:ascii="Times New Roman" w:hAnsi="Times New Roman" w:cs="Times New Roman"/>
         </w:rPr>
-        <w:t>7.2 Progress</w:t>
+        <w:t>7.2 Progress Tracking …...…………..............………...………………...………….. 20</w:t>
       </w:r>
+    </w:p>
+    <w:p>
+      <w:pPr>
+        <w:spacing w:line="360" w:lineRule="auto"/>
+        <w:rPr>
+          <w:rFonts w:ascii="Times New Roman" w:hAnsi="Times New Roman" w:cs="Times New Roman"/>
+        </w:rPr>
+      </w:pPr>
       <w:r>
         <w:rPr>
           <w:rFonts w:ascii="Times New Roman" w:hAnsi="Times New Roman" w:cs="Times New Roman"/>
         </w:rPr>
-        <w:t xml:space="preserve"> </w:t>
+        <w:t>8. Conclusion ………………………………………….…………………………….……… 21</w:t>
       </w:r>
+    </w:p>
+    <w:p>
+      <w:pPr>
+        <w:spacing w:line="360" w:lineRule="auto"/>
+        <w:rPr>
+          <w:rFonts w:ascii="Times New Roman" w:hAnsi="Times New Roman" w:cs="Times New Roman"/>
+        </w:rPr>
+      </w:pPr>
       <w:r>
         <w:rPr>
           <w:rFonts w:ascii="Times New Roman" w:hAnsi="Times New Roman" w:cs="Times New Roman"/>
         </w:rPr>
-        <w:t>Tracking …...…………..............………...………………...………</w:t>
+        <w:t>Appendix A – Evidence Register …………………………………………………...……… 22</w:t>
       </w:r>
-      <w:proofErr w:type="gramStart"/>
+    </w:p>
+    <w:p>
+      <w:pPr>
+        <w:spacing w:line="360" w:lineRule="auto"/>
+        <w:rPr>
+          <w:rFonts w:ascii="Times New Roman" w:hAnsi="Times New Roman" w:cs="Times New Roman"/>
+        </w:rPr>
+      </w:pPr>
       <w:r>
         <w:rPr>
           <w:rFonts w:ascii="Times New Roman" w:hAnsi="Times New Roman" w:cs="Times New Roman"/>
         </w:rPr>
-        <w:t>…..</w:t>
-      </w:r>
-      <w:proofErr w:type="gramEnd"/>
-      <w:r>
-        <w:rPr>
-          <w:rFonts w:ascii="Times New Roman" w:hAnsi="Times New Roman" w:cs="Times New Roman"/>
-        </w:rPr>
-        <w:t xml:space="preserve"> </w:t>
-      </w:r>
-      <w:r>
-        <w:rPr>
-          <w:rFonts w:ascii="Times New Roman" w:hAnsi="Times New Roman" w:cs="Times New Roman"/>
-        </w:rPr>
-        <w:t>2</w:t>
-      </w:r>
-      <w:r>
-        <w:rPr>
-          <w:rFonts w:ascii="Times New Roman" w:hAnsi="Times New Roman" w:cs="Times New Roman"/>
-        </w:rPr>
-        <w:t>0</w:t>
-      </w:r>
-    </w:p>
-    <w:p>
-      <w:pPr>
-        <w:spacing w:line="360" w:lineRule="auto"/>
-        <w:rPr>
-          <w:rFonts w:ascii="Times New Roman" w:hAnsi="Times New Roman" w:cs="Times New Roman"/>
-        </w:rPr>
-      </w:pPr>
-      <w:r>
-        <w:rPr>
-          <w:rFonts w:ascii="Times New Roman" w:hAnsi="Times New Roman" w:cs="Times New Roman"/>
-        </w:rPr>
-        <w:t xml:space="preserve">8. </w:t>
-      </w:r>
-      <w:r>
-        <w:rPr>
-          <w:rFonts w:ascii="Times New Roman" w:hAnsi="Times New Roman" w:cs="Times New Roman"/>
-        </w:rPr>
-        <w:t xml:space="preserve">Conclusion ………………………………………….…………………………….……… </w:t>
-      </w:r>
-      <w:r>
-        <w:rPr>
-          <w:rFonts w:ascii="Times New Roman" w:hAnsi="Times New Roman" w:cs="Times New Roman"/>
-        </w:rPr>
-        <w:t>2</w:t>
-      </w:r>
-      <w:r>
-        <w:rPr>
-          <w:rFonts w:ascii="Times New Roman" w:hAnsi="Times New Roman" w:cs="Times New Roman"/>
-        </w:rPr>
-        <w:t>1</w:t>
-      </w:r>
-    </w:p>
-    <w:p>
-      <w:pPr>
-        <w:spacing w:line="360" w:lineRule="auto"/>
-        <w:rPr>
-          <w:rFonts w:ascii="Times New Roman" w:hAnsi="Times New Roman" w:cs="Times New Roman"/>
-        </w:rPr>
-      </w:pPr>
-      <w:r>
-        <w:rPr>
-          <w:rFonts w:ascii="Times New Roman" w:hAnsi="Times New Roman" w:cs="Times New Roman"/>
-        </w:rPr>
-        <w:t xml:space="preserve">Appendix A – Evidence Register …………………………………………………...……… </w:t>
-      </w:r>
-      <w:r>
-        <w:rPr>
-          <w:rFonts w:ascii="Times New Roman" w:hAnsi="Times New Roman" w:cs="Times New Roman"/>
-        </w:rPr>
-        <w:t>2</w:t>
-      </w:r>
-      <w:r>
-        <w:rPr>
-          <w:rFonts w:ascii="Times New Roman" w:hAnsi="Times New Roman" w:cs="Times New Roman"/>
-        </w:rPr>
-        <w:t>2</w:t>
-      </w:r>
-    </w:p>
-    <w:p>
-      <w:pPr>
-        <w:spacing w:line="360" w:lineRule="auto"/>
-        <w:rPr>
-          <w:rFonts w:ascii="Times New Roman" w:hAnsi="Times New Roman" w:cs="Times New Roman"/>
-        </w:rPr>
-      </w:pPr>
-      <w:r>
-        <w:rPr>
-          <w:rFonts w:ascii="Times New Roman" w:hAnsi="Times New Roman" w:cs="Times New Roman"/>
-        </w:rPr>
-        <w:t xml:space="preserve">Appendix B – Control / Requirement Mapping ……………………………………….…… </w:t>
-      </w:r>
-      <w:r>
-        <w:rPr>
-          <w:rFonts w:ascii="Times New Roman" w:hAnsi="Times New Roman" w:cs="Times New Roman"/>
-        </w:rPr>
-        <w:t>2</w:t>
-      </w:r>
-      <w:r>
-        <w:rPr>
-          <w:rFonts w:ascii="Times New Roman" w:hAnsi="Times New Roman" w:cs="Times New Roman"/>
-        </w:rPr>
-        <w:t>3</w:t>
+        <w:t>Appendix B – Control / Requirement Mapping ……………………………………….…… 23</w:t>
       </w:r>
       <w:r>
         <w:rPr>
@@ -3537,40 +2877,14 @@
         <w:rPr>
           <w:rFonts w:ascii="Times New Roman" w:hAnsi="Times New Roman" w:cs="Times New Roman"/>
         </w:rPr>
-        <w:t xml:space="preserve">Finding </w:t>
+        <w:t xml:space="preserve">Finding 1 - </w:t>
       </w:r>
       <w:r>
         <w:rPr>
           <w:rFonts w:ascii="Times New Roman" w:hAnsi="Times New Roman" w:cs="Times New Roman"/>
-        </w:rPr>
-        <w:t>1</w:t>
-      </w:r>
-      <w:r>
-        <w:rPr>
-          <w:rFonts w:ascii="Times New Roman" w:hAnsi="Times New Roman" w:cs="Times New Roman"/>
-        </w:rPr>
-        <w:t xml:space="preserve"> - </w:t>
-      </w:r>
-      <w:r>
-        <w:rPr>
-          <w:rFonts w:ascii="Times New Roman" w:hAnsi="Times New Roman" w:cs="Times New Roman"/>
           <w:color w:val="0070C0"/>
         </w:rPr>
-        <w:t>{Top_Risk_</w:t>
-      </w:r>
-      <w:r>
-        <w:rPr>
-          <w:rFonts w:ascii="Times New Roman" w:hAnsi="Times New Roman" w:cs="Times New Roman"/>
-          <w:color w:val="0070C0"/>
-        </w:rPr>
-        <w:t>1</w:t>
-      </w:r>
-      <w:r>
-        <w:rPr>
-          <w:rFonts w:ascii="Times New Roman" w:hAnsi="Times New Roman" w:cs="Times New Roman"/>
-          <w:color w:val="0070C0"/>
-        </w:rPr>
-        <w:t>}</w:t>
+        <w:t>{Top_Risk_1}</w:t>
       </w:r>
     </w:p>
     <w:p>
@@ -4485,29 +3799,7 @@
                 <w:sz w:val="72"/>
                 <w:szCs w:val="72"/>
               </w:rPr>
-              <w:t>{Total_C</w:t>
-            </w:r>
-            <w:r>
-              <w:rPr>
-                <w:rFonts w:ascii="Times New Roman" w:hAnsi="Times New Roman" w:cs="Times New Roman"/>
-                <w:b/>
-                <w:bCs/>
-                <w:color w:val="D81E00"/>
-                <w:sz w:val="72"/>
-                <w:szCs w:val="72"/>
-              </w:rPr>
-              <w:t>ritical</w:t>
-            </w:r>
-            <w:r>
-              <w:rPr>
-                <w:rFonts w:ascii="Times New Roman" w:hAnsi="Times New Roman" w:cs="Times New Roman"/>
-                <w:b/>
-                <w:bCs/>
-                <w:color w:val="D81E00"/>
-                <w:sz w:val="72"/>
-                <w:szCs w:val="72"/>
-              </w:rPr>
-              <w:t>}</w:t>
+              <w:t>{Total_Critical}</w:t>
             </w:r>
           </w:p>
           <w:p>
@@ -4636,29 +3928,7 @@
                 <w:sz w:val="72"/>
                 <w:szCs w:val="72"/>
               </w:rPr>
-              <w:t>{Total_</w:t>
-            </w:r>
-            <w:r>
-              <w:rPr>
-                <w:rFonts w:ascii="Times New Roman" w:hAnsi="Times New Roman" w:cs="Times New Roman"/>
-                <w:b/>
-                <w:bCs/>
-                <w:color w:val="D87A00"/>
-                <w:sz w:val="72"/>
-                <w:szCs w:val="72"/>
-              </w:rPr>
-              <w:t>High</w:t>
-            </w:r>
-            <w:r>
-              <w:rPr>
-                <w:rFonts w:ascii="Times New Roman" w:hAnsi="Times New Roman" w:cs="Times New Roman"/>
-                <w:b/>
-                <w:bCs/>
-                <w:color w:val="D87A00"/>
-                <w:sz w:val="72"/>
-                <w:szCs w:val="72"/>
-              </w:rPr>
-              <w:t>}</w:t>
+              <w:t>{Total_High}</w:t>
             </w:r>
           </w:p>
           <w:p>
@@ -4775,29 +4045,7 @@
                 <w:sz w:val="72"/>
                 <w:szCs w:val="72"/>
               </w:rPr>
-              <w:t>{Total_</w:t>
-            </w:r>
-            <w:r>
-              <w:rPr>
-                <w:rFonts w:ascii="Times New Roman" w:hAnsi="Times New Roman" w:cs="Times New Roman"/>
-                <w:b/>
-                <w:bCs/>
-                <w:color w:val="AA7900"/>
-                <w:sz w:val="72"/>
-                <w:szCs w:val="72"/>
-              </w:rPr>
-              <w:t>Medium</w:t>
-            </w:r>
-            <w:r>
-              <w:rPr>
-                <w:rFonts w:ascii="Times New Roman" w:hAnsi="Times New Roman" w:cs="Times New Roman"/>
-                <w:b/>
-                <w:bCs/>
-                <w:color w:val="AA7900"/>
-                <w:sz w:val="72"/>
-                <w:szCs w:val="72"/>
-              </w:rPr>
-              <w:t>}</w:t>
+              <w:t>{Total_Medium}</w:t>
             </w:r>
           </w:p>
           <w:p>
@@ -4912,29 +4160,7 @@
                 <w:sz w:val="72"/>
                 <w:szCs w:val="72"/>
               </w:rPr>
-              <w:t>{Total_</w:t>
-            </w:r>
-            <w:r>
-              <w:rPr>
-                <w:rFonts w:ascii="Times New Roman" w:hAnsi="Times New Roman" w:cs="Times New Roman"/>
-                <w:b/>
-                <w:bCs/>
-                <w:color w:val="007600"/>
-                <w:sz w:val="72"/>
-                <w:szCs w:val="72"/>
-              </w:rPr>
-              <w:t>Low</w:t>
-            </w:r>
-            <w:r>
-              <w:rPr>
-                <w:rFonts w:ascii="Times New Roman" w:hAnsi="Times New Roman" w:cs="Times New Roman"/>
-                <w:b/>
-                <w:bCs/>
-                <w:color w:val="007600"/>
-                <w:sz w:val="72"/>
-                <w:szCs w:val="72"/>
-              </w:rPr>
-              <w:t>}</w:t>
+              <w:t>{Total_Low}</w:t>
             </w:r>
           </w:p>
           <w:p>
@@ -5279,51 +4505,7 @@
                 <w:sz w:val="22"/>
                 <w:szCs w:val="22"/>
               </w:rPr>
-              <w:t>FAIL {Cat_</w:t>
-            </w:r>
-            <w:r>
-              <w:rPr>
-                <w:rFonts w:ascii="Times New Roman" w:hAnsi="Times New Roman" w:cs="Times New Roman"/>
-                <w:b/>
-                <w:bCs/>
-                <w:color w:val="C00000"/>
-                <w:sz w:val="22"/>
-                <w:szCs w:val="22"/>
-              </w:rPr>
-              <w:t>1</w:t>
-            </w:r>
-            <w:r>
-              <w:rPr>
-                <w:rFonts w:ascii="Times New Roman" w:hAnsi="Times New Roman" w:cs="Times New Roman"/>
-                <w:b/>
-                <w:bCs/>
-                <w:color w:val="C00000"/>
-                <w:sz w:val="22"/>
-                <w:szCs w:val="22"/>
-              </w:rPr>
-              <w:t>_</w:t>
-            </w:r>
-            <w:r>
-              <w:rPr>
-                <w:rFonts w:ascii="Times New Roman" w:hAnsi="Times New Roman" w:cs="Times New Roman"/>
-                <w:b/>
-                <w:bCs/>
-                <w:color w:val="C00000"/>
-                <w:sz w:val="22"/>
-                <w:szCs w:val="22"/>
-              </w:rPr>
-              <w:t>Fail</w:t>
-            </w:r>
-            <w:r>
-              <w:rPr>
-                <w:rFonts w:ascii="Times New Roman" w:hAnsi="Times New Roman" w:cs="Times New Roman"/>
-                <w:b/>
-                <w:bCs/>
-                <w:color w:val="C00000"/>
-                <w:sz w:val="22"/>
-                <w:szCs w:val="22"/>
-              </w:rPr>
-              <w:t>}</w:t>
+              <w:t>FAIL {Cat_1_Fail}</w:t>
             </w:r>
           </w:p>
         </w:tc>
@@ -5429,29 +4611,7 @@
                 <w:sz w:val="22"/>
                 <w:szCs w:val="22"/>
               </w:rPr>
-              <w:t>PASS {Cat_</w:t>
-            </w:r>
-            <w:r>
-              <w:rPr>
-                <w:rFonts w:ascii="Times New Roman" w:hAnsi="Times New Roman" w:cs="Times New Roman"/>
-                <w:b/>
-                <w:bCs/>
-                <w:color w:val="007600"/>
-                <w:sz w:val="22"/>
-                <w:szCs w:val="22"/>
-              </w:rPr>
-              <w:t>2</w:t>
-            </w:r>
-            <w:r>
-              <w:rPr>
-                <w:rFonts w:ascii="Times New Roman" w:hAnsi="Times New Roman" w:cs="Times New Roman"/>
-                <w:b/>
-                <w:bCs/>
-                <w:color w:val="007600"/>
-                <w:sz w:val="22"/>
-                <w:szCs w:val="22"/>
-              </w:rPr>
-              <w:t>_Pass}</w:t>
+              <w:t>PASS {Cat_2_Pass}</w:t>
             </w:r>
           </w:p>
         </w:tc>
@@ -5485,51 +4645,7 @@
                 <w:sz w:val="22"/>
                 <w:szCs w:val="22"/>
               </w:rPr>
-              <w:t>FAIL {Cat_</w:t>
-            </w:r>
-            <w:r>
-              <w:rPr>
-                <w:rFonts w:ascii="Times New Roman" w:hAnsi="Times New Roman" w:cs="Times New Roman"/>
-                <w:b/>
-                <w:bCs/>
-                <w:color w:val="C00000"/>
-                <w:sz w:val="22"/>
-                <w:szCs w:val="22"/>
-              </w:rPr>
-              <w:t>2</w:t>
-            </w:r>
-            <w:r>
-              <w:rPr>
-                <w:rFonts w:ascii="Times New Roman" w:hAnsi="Times New Roman" w:cs="Times New Roman"/>
-                <w:b/>
-                <w:bCs/>
-                <w:color w:val="C00000"/>
-                <w:sz w:val="22"/>
-                <w:szCs w:val="22"/>
-              </w:rPr>
-              <w:t>_</w:t>
-            </w:r>
-            <w:r>
-              <w:rPr>
-                <w:rFonts w:ascii="Times New Roman" w:hAnsi="Times New Roman" w:cs="Times New Roman"/>
-                <w:b/>
-                <w:bCs/>
-                <w:color w:val="C00000"/>
-                <w:sz w:val="22"/>
-                <w:szCs w:val="22"/>
-              </w:rPr>
-              <w:t>Fail</w:t>
-            </w:r>
-            <w:r>
-              <w:rPr>
-                <w:rFonts w:ascii="Times New Roman" w:hAnsi="Times New Roman" w:cs="Times New Roman"/>
-                <w:b/>
-                <w:bCs/>
-                <w:color w:val="C00000"/>
-                <w:sz w:val="22"/>
-                <w:szCs w:val="22"/>
-              </w:rPr>
-              <w:t>}</w:t>
+              <w:t>FAIL {Cat_2_Fail}</w:t>
             </w:r>
           </w:p>
         </w:tc>
@@ -5558,25 +4674,7 @@
                 <w:sz w:val="22"/>
                 <w:szCs w:val="22"/>
               </w:rPr>
-              <w:t>{Cat_</w:t>
-            </w:r>
-            <w:r>
-              <w:rPr>
-                <w:rFonts w:ascii="Times New Roman" w:hAnsi="Times New Roman" w:cs="Times New Roman"/>
-                <w:color w:val="0070C0"/>
-                <w:sz w:val="22"/>
-                <w:szCs w:val="22"/>
-              </w:rPr>
-              <w:t>2</w:t>
-            </w:r>
-            <w:r>
-              <w:rPr>
-                <w:rFonts w:ascii="Times New Roman" w:hAnsi="Times New Roman" w:cs="Times New Roman"/>
-                <w:color w:val="0070C0"/>
-                <w:sz w:val="22"/>
-                <w:szCs w:val="22"/>
-              </w:rPr>
-              <w:t>_Total} controls</w:t>
+              <w:t>{Cat_2_Total} controls</w:t>
             </w:r>
           </w:p>
         </w:tc>
@@ -5653,29 +4751,7 @@
                 <w:sz w:val="22"/>
                 <w:szCs w:val="22"/>
               </w:rPr>
-              <w:t>PASS {Cat_</w:t>
-            </w:r>
-            <w:r>
-              <w:rPr>
-                <w:rFonts w:ascii="Times New Roman" w:hAnsi="Times New Roman" w:cs="Times New Roman"/>
-                <w:b/>
-                <w:bCs/>
-                <w:color w:val="007600"/>
-                <w:sz w:val="22"/>
-                <w:szCs w:val="22"/>
-              </w:rPr>
-              <w:t>3</w:t>
-            </w:r>
-            <w:r>
-              <w:rPr>
-                <w:rFonts w:ascii="Times New Roman" w:hAnsi="Times New Roman" w:cs="Times New Roman"/>
-                <w:b/>
-                <w:bCs/>
-                <w:color w:val="007600"/>
-                <w:sz w:val="22"/>
-                <w:szCs w:val="22"/>
-              </w:rPr>
-              <w:t>_Pass}</w:t>
+              <w:t>PASS {Cat_3_Pass}</w:t>
             </w:r>
           </w:p>
         </w:tc>
@@ -5709,51 +4785,7 @@
                 <w:sz w:val="22"/>
                 <w:szCs w:val="22"/>
               </w:rPr>
-              <w:t>FAIL {Cat_</w:t>
-            </w:r>
-            <w:r>
-              <w:rPr>
-                <w:rFonts w:ascii="Times New Roman" w:hAnsi="Times New Roman" w:cs="Times New Roman"/>
-                <w:b/>
-                <w:bCs/>
-                <w:color w:val="C00000"/>
-                <w:sz w:val="22"/>
-                <w:szCs w:val="22"/>
-              </w:rPr>
-              <w:t>3</w:t>
-            </w:r>
-            <w:r>
-              <w:rPr>
-                <w:rFonts w:ascii="Times New Roman" w:hAnsi="Times New Roman" w:cs="Times New Roman"/>
-                <w:b/>
-                <w:bCs/>
-                <w:color w:val="C00000"/>
-                <w:sz w:val="22"/>
-                <w:szCs w:val="22"/>
-              </w:rPr>
-              <w:t>_</w:t>
-            </w:r>
-            <w:r>
-              <w:rPr>
-                <w:rFonts w:ascii="Times New Roman" w:hAnsi="Times New Roman" w:cs="Times New Roman"/>
-                <w:b/>
-                <w:bCs/>
-                <w:color w:val="C00000"/>
-                <w:sz w:val="22"/>
-                <w:szCs w:val="22"/>
-              </w:rPr>
-              <w:t>Fail</w:t>
-            </w:r>
-            <w:r>
-              <w:rPr>
-                <w:rFonts w:ascii="Times New Roman" w:hAnsi="Times New Roman" w:cs="Times New Roman"/>
-                <w:b/>
-                <w:bCs/>
-                <w:color w:val="C00000"/>
-                <w:sz w:val="22"/>
-                <w:szCs w:val="22"/>
-              </w:rPr>
-              <w:t>}</w:t>
+              <w:t>FAIL {Cat_3_Fail}</w:t>
             </w:r>
           </w:p>
         </w:tc>
@@ -5782,25 +4814,7 @@
                 <w:sz w:val="22"/>
                 <w:szCs w:val="22"/>
               </w:rPr>
-              <w:t>{Cat_</w:t>
-            </w:r>
-            <w:r>
-              <w:rPr>
-                <w:rFonts w:ascii="Times New Roman" w:hAnsi="Times New Roman" w:cs="Times New Roman"/>
-                <w:color w:val="0070C0"/>
-                <w:sz w:val="22"/>
-                <w:szCs w:val="22"/>
-              </w:rPr>
-              <w:t>3</w:t>
-            </w:r>
-            <w:r>
-              <w:rPr>
-                <w:rFonts w:ascii="Times New Roman" w:hAnsi="Times New Roman" w:cs="Times New Roman"/>
-                <w:color w:val="0070C0"/>
-                <w:sz w:val="22"/>
-                <w:szCs w:val="22"/>
-              </w:rPr>
-              <w:t>_Total} controls</w:t>
+              <w:t>{Cat_3_Total} controls</w:t>
             </w:r>
           </w:p>
         </w:tc>
@@ -5877,29 +4891,7 @@
                 <w:sz w:val="22"/>
                 <w:szCs w:val="22"/>
               </w:rPr>
-              <w:t>PASS {Cat_</w:t>
-            </w:r>
-            <w:r>
-              <w:rPr>
-                <w:rFonts w:ascii="Times New Roman" w:hAnsi="Times New Roman" w:cs="Times New Roman"/>
-                <w:b/>
-                <w:bCs/>
-                <w:color w:val="007600"/>
-                <w:sz w:val="22"/>
-                <w:szCs w:val="22"/>
-              </w:rPr>
-              <w:t>4</w:t>
-            </w:r>
-            <w:r>
-              <w:rPr>
-                <w:rFonts w:ascii="Times New Roman" w:hAnsi="Times New Roman" w:cs="Times New Roman"/>
-                <w:b/>
-                <w:bCs/>
-                <w:color w:val="007600"/>
-                <w:sz w:val="22"/>
-                <w:szCs w:val="22"/>
-              </w:rPr>
-              <w:t>_Pass}</w:t>
+              <w:t>PASS {Cat_4_Pass}</w:t>
             </w:r>
           </w:p>
         </w:tc>
@@ -5933,51 +4925,7 @@
                 <w:sz w:val="22"/>
                 <w:szCs w:val="22"/>
               </w:rPr>
-              <w:t>FAIL {Cat_</w:t>
-            </w:r>
-            <w:r>
-              <w:rPr>
-                <w:rFonts w:ascii="Times New Roman" w:hAnsi="Times New Roman" w:cs="Times New Roman"/>
-                <w:b/>
-                <w:bCs/>
-                <w:color w:val="C00000"/>
-                <w:sz w:val="22"/>
-                <w:szCs w:val="22"/>
-              </w:rPr>
-              <w:t>4</w:t>
-            </w:r>
-            <w:r>
-              <w:rPr>
-                <w:rFonts w:ascii="Times New Roman" w:hAnsi="Times New Roman" w:cs="Times New Roman"/>
-                <w:b/>
-                <w:bCs/>
-                <w:color w:val="C00000"/>
-                <w:sz w:val="22"/>
-                <w:szCs w:val="22"/>
-              </w:rPr>
-              <w:t>_</w:t>
-            </w:r>
-            <w:r>
-              <w:rPr>
-                <w:rFonts w:ascii="Times New Roman" w:hAnsi="Times New Roman" w:cs="Times New Roman"/>
-                <w:b/>
-                <w:bCs/>
-                <w:color w:val="C00000"/>
-                <w:sz w:val="22"/>
-                <w:szCs w:val="22"/>
-              </w:rPr>
-              <w:t>Fail</w:t>
-            </w:r>
-            <w:r>
-              <w:rPr>
-                <w:rFonts w:ascii="Times New Roman" w:hAnsi="Times New Roman" w:cs="Times New Roman"/>
-                <w:b/>
-                <w:bCs/>
-                <w:color w:val="C00000"/>
-                <w:sz w:val="22"/>
-                <w:szCs w:val="22"/>
-              </w:rPr>
-              <w:t>}</w:t>
+              <w:t>FAIL {Cat_4_Fail}</w:t>
             </w:r>
           </w:p>
         </w:tc>
@@ -6006,25 +4954,7 @@
                 <w:sz w:val="22"/>
                 <w:szCs w:val="22"/>
               </w:rPr>
-              <w:t>{Cat_</w:t>
-            </w:r>
-            <w:r>
-              <w:rPr>
-                <w:rFonts w:ascii="Times New Roman" w:hAnsi="Times New Roman" w:cs="Times New Roman"/>
-                <w:color w:val="0070C0"/>
-                <w:sz w:val="22"/>
-                <w:szCs w:val="22"/>
-              </w:rPr>
-              <w:t>4</w:t>
-            </w:r>
-            <w:r>
-              <w:rPr>
-                <w:rFonts w:ascii="Times New Roman" w:hAnsi="Times New Roman" w:cs="Times New Roman"/>
-                <w:color w:val="0070C0"/>
-                <w:sz w:val="22"/>
-                <w:szCs w:val="22"/>
-              </w:rPr>
-              <w:t>_Total} controls</w:t>
+              <w:t>{Cat_4_Total} controls</w:t>
             </w:r>
           </w:p>
         </w:tc>
@@ -6101,29 +5031,7 @@
                 <w:sz w:val="22"/>
                 <w:szCs w:val="22"/>
               </w:rPr>
-              <w:t>PASS {Cat_</w:t>
-            </w:r>
-            <w:r>
-              <w:rPr>
-                <w:rFonts w:ascii="Times New Roman" w:hAnsi="Times New Roman" w:cs="Times New Roman"/>
-                <w:b/>
-                <w:bCs/>
-                <w:color w:val="007600"/>
-                <w:sz w:val="22"/>
-                <w:szCs w:val="22"/>
-              </w:rPr>
-              <w:t>5</w:t>
-            </w:r>
-            <w:r>
-              <w:rPr>
-                <w:rFonts w:ascii="Times New Roman" w:hAnsi="Times New Roman" w:cs="Times New Roman"/>
-                <w:b/>
-                <w:bCs/>
-                <w:color w:val="007600"/>
-                <w:sz w:val="22"/>
-                <w:szCs w:val="22"/>
-              </w:rPr>
-              <w:t>_Pass}</w:t>
+              <w:t>PASS {Cat_5_Pass}</w:t>
             </w:r>
           </w:p>
         </w:tc>
@@ -6157,51 +5065,7 @@
                 <w:sz w:val="22"/>
                 <w:szCs w:val="22"/>
               </w:rPr>
-              <w:t>FAIL {Cat_</w:t>
-            </w:r>
-            <w:r>
-              <w:rPr>
-                <w:rFonts w:ascii="Times New Roman" w:hAnsi="Times New Roman" w:cs="Times New Roman"/>
-                <w:b/>
-                <w:bCs/>
-                <w:color w:val="C00000"/>
-                <w:sz w:val="22"/>
-                <w:szCs w:val="22"/>
-              </w:rPr>
-              <w:t>5</w:t>
-            </w:r>
-            <w:r>
-              <w:rPr>
-                <w:rFonts w:ascii="Times New Roman" w:hAnsi="Times New Roman" w:cs="Times New Roman"/>
-                <w:b/>
-                <w:bCs/>
-                <w:color w:val="C00000"/>
-                <w:sz w:val="22"/>
-                <w:szCs w:val="22"/>
-              </w:rPr>
-              <w:t>_</w:t>
-            </w:r>
-            <w:r>
-              <w:rPr>
-                <w:rFonts w:ascii="Times New Roman" w:hAnsi="Times New Roman" w:cs="Times New Roman"/>
-                <w:b/>
-                <w:bCs/>
-                <w:color w:val="C00000"/>
-                <w:sz w:val="22"/>
-                <w:szCs w:val="22"/>
-              </w:rPr>
-              <w:t>Fail</w:t>
-            </w:r>
-            <w:r>
-              <w:rPr>
-                <w:rFonts w:ascii="Times New Roman" w:hAnsi="Times New Roman" w:cs="Times New Roman"/>
-                <w:b/>
-                <w:bCs/>
-                <w:color w:val="C00000"/>
-                <w:sz w:val="22"/>
-                <w:szCs w:val="22"/>
-              </w:rPr>
-              <w:t>}</w:t>
+              <w:t>FAIL {Cat_5_Fail}</w:t>
             </w:r>
           </w:p>
         </w:tc>
@@ -6230,25 +5094,7 @@
                 <w:sz w:val="22"/>
                 <w:szCs w:val="22"/>
               </w:rPr>
-              <w:t>{Cat_</w:t>
-            </w:r>
-            <w:r>
-              <w:rPr>
-                <w:rFonts w:ascii="Times New Roman" w:hAnsi="Times New Roman" w:cs="Times New Roman"/>
-                <w:color w:val="0070C0"/>
-                <w:sz w:val="22"/>
-                <w:szCs w:val="22"/>
-              </w:rPr>
-              <w:t>5</w:t>
-            </w:r>
-            <w:r>
-              <w:rPr>
-                <w:rFonts w:ascii="Times New Roman" w:hAnsi="Times New Roman" w:cs="Times New Roman"/>
-                <w:color w:val="0070C0"/>
-                <w:sz w:val="22"/>
-                <w:szCs w:val="22"/>
-              </w:rPr>
-              <w:t>_Total} controls</w:t>
+              <w:t>{Cat_5_Total} controls</w:t>
             </w:r>
           </w:p>
         </w:tc>
@@ -6325,29 +5171,7 @@
                 <w:sz w:val="22"/>
                 <w:szCs w:val="22"/>
               </w:rPr>
-              <w:t>PASS {Cat_</w:t>
-            </w:r>
-            <w:r>
-              <w:rPr>
-                <w:rFonts w:ascii="Times New Roman" w:hAnsi="Times New Roman" w:cs="Times New Roman"/>
-                <w:b/>
-                <w:bCs/>
-                <w:color w:val="007600"/>
-                <w:sz w:val="22"/>
-                <w:szCs w:val="22"/>
-              </w:rPr>
-              <w:t>6</w:t>
-            </w:r>
-            <w:r>
-              <w:rPr>
-                <w:rFonts w:ascii="Times New Roman" w:hAnsi="Times New Roman" w:cs="Times New Roman"/>
-                <w:b/>
-                <w:bCs/>
-                <w:color w:val="007600"/>
-                <w:sz w:val="22"/>
-                <w:szCs w:val="22"/>
-              </w:rPr>
-              <w:t>_Pass}</w:t>
+              <w:t>PASS {Cat_6_Pass}</w:t>
             </w:r>
           </w:p>
         </w:tc>
@@ -6381,51 +5205,7 @@
                 <w:sz w:val="22"/>
                 <w:szCs w:val="22"/>
               </w:rPr>
-              <w:t>FAIL {Cat_</w:t>
-            </w:r>
-            <w:r>
-              <w:rPr>
-                <w:rFonts w:ascii="Times New Roman" w:hAnsi="Times New Roman" w:cs="Times New Roman"/>
-                <w:b/>
-                <w:bCs/>
-                <w:color w:val="C00000"/>
-                <w:sz w:val="22"/>
-                <w:szCs w:val="22"/>
-              </w:rPr>
-              <w:t>6</w:t>
-            </w:r>
-            <w:r>
-              <w:rPr>
-                <w:rFonts w:ascii="Times New Roman" w:hAnsi="Times New Roman" w:cs="Times New Roman"/>
-                <w:b/>
-                <w:bCs/>
-                <w:color w:val="C00000"/>
-                <w:sz w:val="22"/>
-                <w:szCs w:val="22"/>
-              </w:rPr>
-              <w:t>_</w:t>
-            </w:r>
-            <w:r>
-              <w:rPr>
-                <w:rFonts w:ascii="Times New Roman" w:hAnsi="Times New Roman" w:cs="Times New Roman"/>
-                <w:b/>
-                <w:bCs/>
-                <w:color w:val="C00000"/>
-                <w:sz w:val="22"/>
-                <w:szCs w:val="22"/>
-              </w:rPr>
-              <w:t>Fail</w:t>
-            </w:r>
-            <w:r>
-              <w:rPr>
-                <w:rFonts w:ascii="Times New Roman" w:hAnsi="Times New Roman" w:cs="Times New Roman"/>
-                <w:b/>
-                <w:bCs/>
-                <w:color w:val="C00000"/>
-                <w:sz w:val="22"/>
-                <w:szCs w:val="22"/>
-              </w:rPr>
-              <w:t>}</w:t>
+              <w:t>FAIL {Cat_6_Fail}</w:t>
             </w:r>
           </w:p>
         </w:tc>
@@ -6454,25 +5234,7 @@
                 <w:sz w:val="22"/>
                 <w:szCs w:val="22"/>
               </w:rPr>
-              <w:t>{Cat_</w:t>
-            </w:r>
-            <w:r>
-              <w:rPr>
-                <w:rFonts w:ascii="Times New Roman" w:hAnsi="Times New Roman" w:cs="Times New Roman"/>
-                <w:color w:val="0070C0"/>
-                <w:sz w:val="22"/>
-                <w:szCs w:val="22"/>
-              </w:rPr>
-              <w:t>6</w:t>
-            </w:r>
-            <w:r>
-              <w:rPr>
-                <w:rFonts w:ascii="Times New Roman" w:hAnsi="Times New Roman" w:cs="Times New Roman"/>
-                <w:color w:val="0070C0"/>
-                <w:sz w:val="22"/>
-                <w:szCs w:val="22"/>
-              </w:rPr>
-              <w:t>_Total} controls</w:t>
+              <w:t>{Cat_6_Total} controls</w:t>
             </w:r>
           </w:p>
         </w:tc>
@@ -6549,29 +5311,7 @@
                 <w:sz w:val="22"/>
                 <w:szCs w:val="22"/>
               </w:rPr>
-              <w:t>PASS {Cat_</w:t>
-            </w:r>
-            <w:r>
-              <w:rPr>
-                <w:rFonts w:ascii="Times New Roman" w:hAnsi="Times New Roman" w:cs="Times New Roman"/>
-                <w:b/>
-                <w:bCs/>
-                <w:color w:val="007600"/>
-                <w:sz w:val="22"/>
-                <w:szCs w:val="22"/>
-              </w:rPr>
-              <w:t>7</w:t>
-            </w:r>
-            <w:r>
-              <w:rPr>
-                <w:rFonts w:ascii="Times New Roman" w:hAnsi="Times New Roman" w:cs="Times New Roman"/>
-                <w:b/>
-                <w:bCs/>
-                <w:color w:val="007600"/>
-                <w:sz w:val="22"/>
-                <w:szCs w:val="22"/>
-              </w:rPr>
-              <w:t>_Pass}</w:t>
+              <w:t>PASS {Cat_7_Pass}</w:t>
             </w:r>
           </w:p>
         </w:tc>
@@ -6605,51 +5345,7 @@
                 <w:sz w:val="22"/>
                 <w:szCs w:val="22"/>
               </w:rPr>
-              <w:t>FAIL {Cat_</w:t>
-            </w:r>
-            <w:r>
-              <w:rPr>
-                <w:rFonts w:ascii="Times New Roman" w:hAnsi="Times New Roman" w:cs="Times New Roman"/>
-                <w:b/>
-                <w:bCs/>
-                <w:color w:val="C00000"/>
-                <w:sz w:val="22"/>
-                <w:szCs w:val="22"/>
-              </w:rPr>
-              <w:t>7</w:t>
-            </w:r>
-            <w:r>
-              <w:rPr>
-                <w:rFonts w:ascii="Times New Roman" w:hAnsi="Times New Roman" w:cs="Times New Roman"/>
-                <w:b/>
-                <w:bCs/>
-                <w:color w:val="C00000"/>
-                <w:sz w:val="22"/>
-                <w:szCs w:val="22"/>
-              </w:rPr>
-              <w:t>_</w:t>
-            </w:r>
-            <w:r>
-              <w:rPr>
-                <w:rFonts w:ascii="Times New Roman" w:hAnsi="Times New Roman" w:cs="Times New Roman"/>
-                <w:b/>
-                <w:bCs/>
-                <w:color w:val="C00000"/>
-                <w:sz w:val="22"/>
-                <w:szCs w:val="22"/>
-              </w:rPr>
-              <w:t>Fail</w:t>
-            </w:r>
-            <w:r>
-              <w:rPr>
-                <w:rFonts w:ascii="Times New Roman" w:hAnsi="Times New Roman" w:cs="Times New Roman"/>
-                <w:b/>
-                <w:bCs/>
-                <w:color w:val="C00000"/>
-                <w:sz w:val="22"/>
-                <w:szCs w:val="22"/>
-              </w:rPr>
-              <w:t>}</w:t>
+              <w:t>FAIL {Cat_7_Fail}</w:t>
             </w:r>
           </w:p>
         </w:tc>
@@ -6678,25 +5374,7 @@
                 <w:sz w:val="22"/>
                 <w:szCs w:val="22"/>
               </w:rPr>
-              <w:t>{Cat_</w:t>
-            </w:r>
-            <w:r>
-              <w:rPr>
-                <w:rFonts w:ascii="Times New Roman" w:hAnsi="Times New Roman" w:cs="Times New Roman"/>
-                <w:color w:val="0070C0"/>
-                <w:sz w:val="22"/>
-                <w:szCs w:val="22"/>
-              </w:rPr>
-              <w:t>7</w:t>
-            </w:r>
-            <w:r>
-              <w:rPr>
-                <w:rFonts w:ascii="Times New Roman" w:hAnsi="Times New Roman" w:cs="Times New Roman"/>
-                <w:color w:val="0070C0"/>
-                <w:sz w:val="22"/>
-                <w:szCs w:val="22"/>
-              </w:rPr>
-              <w:t>_Total} controls</w:t>
+              <w:t>{Cat_7_Total} controls</w:t>
             </w:r>
           </w:p>
         </w:tc>
@@ -6773,29 +5451,7 @@
                 <w:sz w:val="22"/>
                 <w:szCs w:val="22"/>
               </w:rPr>
-              <w:t>PASS {Cat_</w:t>
-            </w:r>
-            <w:r>
-              <w:rPr>
-                <w:rFonts w:ascii="Times New Roman" w:hAnsi="Times New Roman" w:cs="Times New Roman"/>
-                <w:b/>
-                <w:bCs/>
-                <w:color w:val="007600"/>
-                <w:sz w:val="22"/>
-                <w:szCs w:val="22"/>
-              </w:rPr>
-              <w:t>8</w:t>
-            </w:r>
-            <w:r>
-              <w:rPr>
-                <w:rFonts w:ascii="Times New Roman" w:hAnsi="Times New Roman" w:cs="Times New Roman"/>
-                <w:b/>
-                <w:bCs/>
-                <w:color w:val="007600"/>
-                <w:sz w:val="22"/>
-                <w:szCs w:val="22"/>
-              </w:rPr>
-              <w:t>_Pass}</w:t>
+              <w:t>PASS {Cat_8_Pass}</w:t>
             </w:r>
           </w:p>
         </w:tc>
@@ -6829,51 +5485,7 @@
                 <w:sz w:val="22"/>
                 <w:szCs w:val="22"/>
               </w:rPr>
-              <w:t>FAIL {Cat_</w:t>
-            </w:r>
-            <w:r>
-              <w:rPr>
-                <w:rFonts w:ascii="Times New Roman" w:hAnsi="Times New Roman" w:cs="Times New Roman"/>
-                <w:b/>
-                <w:bCs/>
-                <w:color w:val="C00000"/>
-                <w:sz w:val="22"/>
-                <w:szCs w:val="22"/>
-              </w:rPr>
-              <w:t>8</w:t>
-            </w:r>
-            <w:r>
-              <w:rPr>
-                <w:rFonts w:ascii="Times New Roman" w:hAnsi="Times New Roman" w:cs="Times New Roman"/>
-                <w:b/>
-                <w:bCs/>
-                <w:color w:val="C00000"/>
-                <w:sz w:val="22"/>
-                <w:szCs w:val="22"/>
-              </w:rPr>
-              <w:t>_</w:t>
-            </w:r>
-            <w:r>
-              <w:rPr>
-                <w:rFonts w:ascii="Times New Roman" w:hAnsi="Times New Roman" w:cs="Times New Roman"/>
-                <w:b/>
-                <w:bCs/>
-                <w:color w:val="C00000"/>
-                <w:sz w:val="22"/>
-                <w:szCs w:val="22"/>
-              </w:rPr>
-              <w:t>Fail</w:t>
-            </w:r>
-            <w:r>
-              <w:rPr>
-                <w:rFonts w:ascii="Times New Roman" w:hAnsi="Times New Roman" w:cs="Times New Roman"/>
-                <w:b/>
-                <w:bCs/>
-                <w:color w:val="C00000"/>
-                <w:sz w:val="22"/>
-                <w:szCs w:val="22"/>
-              </w:rPr>
-              <w:t>}</w:t>
+              <w:t>FAIL {Cat_8_Fail}</w:t>
             </w:r>
           </w:p>
         </w:tc>
@@ -6902,25 +5514,7 @@
                 <w:sz w:val="22"/>
                 <w:szCs w:val="22"/>
               </w:rPr>
-              <w:t>{Cat_</w:t>
-            </w:r>
-            <w:r>
-              <w:rPr>
-                <w:rFonts w:ascii="Times New Roman" w:hAnsi="Times New Roman" w:cs="Times New Roman"/>
-                <w:color w:val="0070C0"/>
-                <w:sz w:val="22"/>
-                <w:szCs w:val="22"/>
-              </w:rPr>
-              <w:t>8</w:t>
-            </w:r>
-            <w:r>
-              <w:rPr>
-                <w:rFonts w:ascii="Times New Roman" w:hAnsi="Times New Roman" w:cs="Times New Roman"/>
-                <w:color w:val="0070C0"/>
-                <w:sz w:val="22"/>
-                <w:szCs w:val="22"/>
-              </w:rPr>
-              <w:t>_Total} controls</w:t>
+              <w:t>{Cat_8_Total} controls</w:t>
             </w:r>
           </w:p>
         </w:tc>
@@ -6997,29 +5591,7 @@
                 <w:sz w:val="22"/>
                 <w:szCs w:val="22"/>
               </w:rPr>
-              <w:t>PASS {Cat_</w:t>
-            </w:r>
-            <w:r>
-              <w:rPr>
-                <w:rFonts w:ascii="Times New Roman" w:hAnsi="Times New Roman" w:cs="Times New Roman"/>
-                <w:b/>
-                <w:bCs/>
-                <w:color w:val="007600"/>
-                <w:sz w:val="22"/>
-                <w:szCs w:val="22"/>
-              </w:rPr>
-              <w:t>9</w:t>
-            </w:r>
-            <w:r>
-              <w:rPr>
-                <w:rFonts w:ascii="Times New Roman" w:hAnsi="Times New Roman" w:cs="Times New Roman"/>
-                <w:b/>
-                <w:bCs/>
-                <w:color w:val="007600"/>
-                <w:sz w:val="22"/>
-                <w:szCs w:val="22"/>
-              </w:rPr>
-              <w:t>_Pass}</w:t>
+              <w:t>PASS {Cat_9_Pass}</w:t>
             </w:r>
           </w:p>
         </w:tc>
@@ -7053,51 +5625,7 @@
                 <w:sz w:val="22"/>
                 <w:szCs w:val="22"/>
               </w:rPr>
-              <w:t>FAIL {Cat_</w:t>
-            </w:r>
-            <w:r>
-              <w:rPr>
-                <w:rFonts w:ascii="Times New Roman" w:hAnsi="Times New Roman" w:cs="Times New Roman"/>
-                <w:b/>
-                <w:bCs/>
-                <w:color w:val="C00000"/>
-                <w:sz w:val="22"/>
-                <w:szCs w:val="22"/>
-              </w:rPr>
-              <w:t>9</w:t>
-            </w:r>
-            <w:r>
-              <w:rPr>
-                <w:rFonts w:ascii="Times New Roman" w:hAnsi="Times New Roman" w:cs="Times New Roman"/>
-                <w:b/>
-                <w:bCs/>
-                <w:color w:val="C00000"/>
-                <w:sz w:val="22"/>
-                <w:szCs w:val="22"/>
-              </w:rPr>
-              <w:t>_</w:t>
-            </w:r>
-            <w:r>
-              <w:rPr>
-                <w:rFonts w:ascii="Times New Roman" w:hAnsi="Times New Roman" w:cs="Times New Roman"/>
-                <w:b/>
-                <w:bCs/>
-                <w:color w:val="C00000"/>
-                <w:sz w:val="22"/>
-                <w:szCs w:val="22"/>
-              </w:rPr>
-              <w:t>Fail</w:t>
-            </w:r>
-            <w:r>
-              <w:rPr>
-                <w:rFonts w:ascii="Times New Roman" w:hAnsi="Times New Roman" w:cs="Times New Roman"/>
-                <w:b/>
-                <w:bCs/>
-                <w:color w:val="C00000"/>
-                <w:sz w:val="22"/>
-                <w:szCs w:val="22"/>
-              </w:rPr>
-              <w:t>}</w:t>
+              <w:t>FAIL {Cat_9_Fail}</w:t>
             </w:r>
           </w:p>
         </w:tc>
@@ -7126,25 +5654,7 @@
                 <w:sz w:val="22"/>
                 <w:szCs w:val="22"/>
               </w:rPr>
-              <w:t>{Cat_</w:t>
-            </w:r>
-            <w:r>
-              <w:rPr>
-                <w:rFonts w:ascii="Times New Roman" w:hAnsi="Times New Roman" w:cs="Times New Roman"/>
-                <w:color w:val="0070C0"/>
-                <w:sz w:val="22"/>
-                <w:szCs w:val="22"/>
-              </w:rPr>
-              <w:t>9</w:t>
-            </w:r>
-            <w:r>
-              <w:rPr>
-                <w:rFonts w:ascii="Times New Roman" w:hAnsi="Times New Roman" w:cs="Times New Roman"/>
-                <w:color w:val="0070C0"/>
-                <w:sz w:val="22"/>
-                <w:szCs w:val="22"/>
-              </w:rPr>
-              <w:t>_Total} controls</w:t>
+              <w:t>{Cat_9_Total} controls</w:t>
             </w:r>
           </w:p>
         </w:tc>
@@ -7180,18 +5690,8 @@
           <w:b/>
           <w:bCs/>
         </w:rPr>
-        <w:t xml:space="preserve">Key Findings </w:t>
+        <w:t>Key Findings at a Glance</w:t>
       </w:r>
-      <w:proofErr w:type="gramStart"/>
-      <w:r>
-        <w:rPr>
-          <w:rFonts w:ascii="Times New Roman" w:hAnsi="Times New Roman" w:cs="Times New Roman"/>
-          <w:b/>
-          <w:bCs/>
-        </w:rPr>
-        <w:t>at a Glance</w:t>
-      </w:r>
-      <w:proofErr w:type="gramEnd"/>
     </w:p>
     <w:tbl>
       <w:tblPr>
@@ -8004,25 +6504,7 @@
                 <w:sz w:val="22"/>
                 <w:szCs w:val="22"/>
               </w:rPr>
-              <w:t>{Top_Risk_</w:t>
-            </w:r>
-            <w:r>
-              <w:rPr>
-                <w:rFonts w:ascii="Times New Roman" w:hAnsi="Times New Roman" w:cs="Times New Roman"/>
-                <w:color w:val="0070C0"/>
-                <w:sz w:val="22"/>
-                <w:szCs w:val="22"/>
-              </w:rPr>
-              <w:t>1</w:t>
-            </w:r>
-            <w:r>
-              <w:rPr>
-                <w:rFonts w:ascii="Times New Roman" w:hAnsi="Times New Roman" w:cs="Times New Roman"/>
-                <w:color w:val="0070C0"/>
-                <w:sz w:val="22"/>
-                <w:szCs w:val="22"/>
-              </w:rPr>
-              <w:t>}</w:t>
+              <w:t>{Top_Risk_1}</w:t>
             </w:r>
           </w:p>
           <w:p>
@@ -8374,17 +6856,7 @@
           <w:szCs w:val="32"/>
         </w:rPr>
         <w:lastRenderedPageBreak/>
-        <w:t xml:space="preserve">1. </w:t>
-      </w:r>
-      <w:r>
-        <w:rPr>
-          <w:rFonts w:ascii="Times New Roman" w:hAnsi="Times New Roman" w:cs="Times New Roman"/>
-          <w:b/>
-          <w:bCs/>
-          <w:sz w:val="32"/>
-          <w:szCs w:val="32"/>
-        </w:rPr>
-        <w:t>Purpose</w:t>
+        <w:t>1. Purpose</w:t>
       </w:r>
     </w:p>
     <w:p>
@@ -8663,17 +7135,7 @@
           <w:szCs w:val="32"/>
         </w:rPr>
         <w:lastRenderedPageBreak/>
-        <w:t xml:space="preserve">2. </w:t>
-      </w:r>
-      <w:r>
-        <w:rPr>
-          <w:rFonts w:ascii="Times New Roman" w:hAnsi="Times New Roman" w:cs="Times New Roman"/>
-          <w:b/>
-          <w:bCs/>
-          <w:sz w:val="32"/>
-          <w:szCs w:val="32"/>
-        </w:rPr>
-        <w:t>Scope</w:t>
+        <w:t>2. Scope</w:t>
       </w:r>
     </w:p>
     <w:p>
@@ -8888,25 +7350,7 @@
                 <w:sz w:val="22"/>
                 <w:szCs w:val="22"/>
               </w:rPr>
-              <w:t>{</w:t>
-            </w:r>
-            <w:r>
-              <w:rPr>
-                <w:rFonts w:ascii="Times New Roman" w:hAnsi="Times New Roman" w:cs="Times New Roman"/>
-                <w:color w:val="0070C0"/>
-                <w:sz w:val="22"/>
-                <w:szCs w:val="22"/>
-              </w:rPr>
-              <w:t>Scope_Owner</w:t>
-            </w:r>
-            <w:r>
-              <w:rPr>
-                <w:rFonts w:ascii="Times New Roman" w:hAnsi="Times New Roman" w:cs="Times New Roman"/>
-                <w:color w:val="0070C0"/>
-                <w:sz w:val="22"/>
-                <w:szCs w:val="22"/>
-              </w:rPr>
-              <w:t>}</w:t>
+              <w:t>{Scope_Owner}</w:t>
             </w:r>
           </w:p>
         </w:tc>
@@ -10118,31 +8562,7 @@
         <w:rPr>
           <w:rFonts w:ascii="Times New Roman" w:hAnsi="Times New Roman" w:cs="Times New Roman"/>
         </w:rPr>
-        <w:t xml:space="preserve">This assessment reflects a point-in-time snapshot. Results depend on </w:t>
-      </w:r>
-      <w:r>
-        <w:rPr>
-          <w:rFonts w:ascii="Times New Roman" w:hAnsi="Times New Roman" w:cs="Times New Roman"/>
-        </w:rPr>
-        <w:t>the</w:t>
-      </w:r>
-      <w:r>
-        <w:rPr>
-          <w:rFonts w:ascii="Times New Roman" w:hAnsi="Times New Roman" w:cs="Times New Roman"/>
-        </w:rPr>
-        <w:t xml:space="preserve"> accuracy </w:t>
-      </w:r>
-      <w:r>
-        <w:rPr>
-          <w:rFonts w:ascii="Times New Roman" w:hAnsi="Times New Roman" w:cs="Times New Roman"/>
-        </w:rPr>
-        <w:t xml:space="preserve">of data </w:t>
-      </w:r>
-      <w:r>
-        <w:rPr>
-          <w:rFonts w:ascii="Times New Roman" w:hAnsi="Times New Roman" w:cs="Times New Roman"/>
-        </w:rPr>
-        <w:t>from the Entra ID API. Manual controls and non-M365 systems are not in scope.</w:t>
+        <w:t>This assessment reflects a point-in-time snapshot. Results depend on the accuracy of data from the Entra ID API. Manual controls and non-M365 systems are not in scope.</w:t>
       </w:r>
     </w:p>
     <w:p>
@@ -10309,17 +8729,7 @@
           <w:szCs w:val="32"/>
         </w:rPr>
         <w:lastRenderedPageBreak/>
-        <w:t xml:space="preserve">3. </w:t>
-      </w:r>
-      <w:r>
-        <w:rPr>
-          <w:rFonts w:ascii="Times New Roman" w:hAnsi="Times New Roman" w:cs="Times New Roman"/>
-          <w:b/>
-          <w:bCs/>
-          <w:sz w:val="32"/>
-          <w:szCs w:val="32"/>
-        </w:rPr>
-        <w:t>Audit Criteria and Methodology</w:t>
+        <w:t>3. Audit Criteria and Methodology</w:t>
       </w:r>
     </w:p>
     <w:p>
@@ -11256,17 +9666,7 @@
           <w:szCs w:val="32"/>
         </w:rPr>
         <w:lastRenderedPageBreak/>
-        <w:t xml:space="preserve">4. </w:t>
-      </w:r>
-      <w:r>
-        <w:rPr>
-          <w:rFonts w:ascii="Times New Roman" w:hAnsi="Times New Roman" w:cs="Times New Roman"/>
-          <w:b/>
-          <w:bCs/>
-          <w:sz w:val="32"/>
-          <w:szCs w:val="32"/>
-        </w:rPr>
-        <w:t>Compliance Summary</w:t>
+        <w:t>4. Compliance Summary</w:t>
       </w:r>
     </w:p>
     <w:p>
@@ -13940,15 +12340,7 @@
           <w:bCs/>
         </w:rPr>
         <w:lastRenderedPageBreak/>
-        <w:t>4.3</w:t>
-      </w:r>
-      <w:r>
-        <w:rPr>
-          <w:rFonts w:ascii="Times New Roman" w:hAnsi="Times New Roman" w:cs="Times New Roman"/>
-          <w:b/>
-          <w:bCs/>
-        </w:rPr>
-        <w:t xml:space="preserve"> Finding Severity Summary</w:t>
+        <w:t>4.3 Finding Severity Summary</w:t>
       </w:r>
     </w:p>
     <w:tbl>
@@ -14799,17 +13191,7 @@
           <w:szCs w:val="32"/>
         </w:rPr>
         <w:lastRenderedPageBreak/>
-        <w:t xml:space="preserve">5. </w:t>
-      </w:r>
-      <w:r>
-        <w:rPr>
-          <w:rFonts w:ascii="Times New Roman" w:hAnsi="Times New Roman" w:cs="Times New Roman"/>
-          <w:b/>
-          <w:bCs/>
-          <w:sz w:val="32"/>
-          <w:szCs w:val="32"/>
-        </w:rPr>
-        <w:t xml:space="preserve">Areas of Strength </w:t>
+        <w:t xml:space="preserve">5. Areas of Strength </w:t>
       </w:r>
     </w:p>
     <w:p>
@@ -14824,31 +13206,7 @@
         <w:rPr>
           <w:rFonts w:ascii="Times New Roman" w:hAnsi="Times New Roman" w:cs="Times New Roman"/>
         </w:rPr>
-        <w:t xml:space="preserve">The following controls were </w:t>
-      </w:r>
-      <w:r>
-        <w:rPr>
-          <w:rFonts w:ascii="Times New Roman" w:hAnsi="Times New Roman" w:cs="Times New Roman"/>
-        </w:rPr>
-        <w:t>foun</w:t>
-      </w:r>
-      <w:r>
-        <w:rPr>
-          <w:rFonts w:ascii="Times New Roman" w:hAnsi="Times New Roman" w:cs="Times New Roman"/>
-        </w:rPr>
-        <w:t xml:space="preserve">d </w:t>
-      </w:r>
-      <w:r>
-        <w:rPr>
-          <w:rFonts w:ascii="Times New Roman" w:hAnsi="Times New Roman" w:cs="Times New Roman"/>
-        </w:rPr>
-        <w:t>to be</w:t>
-      </w:r>
-      <w:r>
-        <w:rPr>
-          <w:rFonts w:ascii="Times New Roman" w:hAnsi="Times New Roman" w:cs="Times New Roman"/>
-        </w:rPr>
-        <w:t xml:space="preserve"> operating effectively. These represent a strong foundation to build on and should be maintained throughout remediation.</w:t>
+        <w:t>The following controls were found to be operating effectively. These represent a strong foundation to build on and should be maintained throughout remediation.</w:t>
       </w:r>
     </w:p>
     <w:tbl>
@@ -15598,17 +13956,7 @@
           <w:szCs w:val="32"/>
         </w:rPr>
         <w:lastRenderedPageBreak/>
-        <w:t xml:space="preserve">6. </w:t>
-      </w:r>
-      <w:r>
-        <w:rPr>
-          <w:rFonts w:ascii="Times New Roman" w:hAnsi="Times New Roman" w:cs="Times New Roman"/>
-          <w:b/>
-          <w:bCs/>
-          <w:sz w:val="32"/>
-          <w:szCs w:val="32"/>
-        </w:rPr>
-        <w:t>Detailed Findings</w:t>
+        <w:t>6. Detailed Findings</w:t>
       </w:r>
     </w:p>
     <w:p>
@@ -15642,49 +13990,7 @@
           <w:b/>
           <w:bCs/>
         </w:rPr>
-        <w:t>6.1 {</w:t>
-      </w:r>
-      <w:proofErr w:type="spellStart"/>
-      <w:r>
-        <w:rPr>
-          <w:rFonts w:ascii="Times New Roman" w:hAnsi="Times New Roman" w:cs="Times New Roman"/>
-          <w:b/>
-          <w:bCs/>
-        </w:rPr>
-        <w:t>Control</w:t>
-      </w:r>
-      <w:r>
-        <w:rPr>
-          <w:rFonts w:ascii="Times New Roman" w:hAnsi="Times New Roman" w:cs="Times New Roman"/>
-          <w:b/>
-          <w:bCs/>
-        </w:rPr>
-        <w:t>_</w:t>
-      </w:r>
-      <w:r>
-        <w:rPr>
-          <w:rFonts w:ascii="Times New Roman" w:hAnsi="Times New Roman" w:cs="Times New Roman"/>
-          <w:b/>
-          <w:bCs/>
-        </w:rPr>
-        <w:t>Name</w:t>
-      </w:r>
-      <w:proofErr w:type="spellEnd"/>
-      <w:r>
-        <w:rPr>
-          <w:rFonts w:ascii="Times New Roman" w:hAnsi="Times New Roman" w:cs="Times New Roman"/>
-          <w:b/>
-          <w:bCs/>
-        </w:rPr>
-        <w:t>}</w:t>
-      </w:r>
-      <w:r>
-        <w:rPr>
-          <w:rFonts w:ascii="Times New Roman" w:hAnsi="Times New Roman" w:cs="Times New Roman"/>
-          <w:b/>
-          <w:bCs/>
-        </w:rPr>
-        <w:t xml:space="preserve"> - (Critical)</w:t>
+        <w:t>6.1 {Control_Name} - (Critical)</w:t>
       </w:r>
     </w:p>
     <w:tbl>
@@ -16793,7 +15099,7 @@
                 <w:sz w:val="22"/>
                 <w:szCs w:val="22"/>
               </w:rPr>
-              <w:t>Recommendation (Legacy)</w:t>
+              <w:t>Owner</w:t>
             </w:r>
           </w:p>
         </w:tc>
@@ -16806,19 +15112,31 @@
               <w:spacing w:line="276" w:lineRule="auto"/>
               <w:rPr>
                 <w:rFonts w:ascii="Times New Roman" w:hAnsi="Times New Roman" w:cs="Times New Roman"/>
-                <w:sz w:val="22"/>
-                <w:szCs w:val="22"/>
-              </w:rPr>
-            </w:pPr>
-            <w:r>
-              <w:rPr>
-                <w:rFonts w:ascii="Times New Roman" w:hAnsi="Times New Roman" w:cs="Times New Roman"/>
-                <w:color w:val="0070C0"/>
-                <w:sz w:val="22"/>
-                <w:szCs w:val="22"/>
-              </w:rPr>
-              <w:t>{Recommendations}</w:t>
-            </w:r>
+                <w:color w:val="0070C0"/>
+                <w:sz w:val="22"/>
+                <w:szCs w:val="22"/>
+              </w:rPr>
+            </w:pPr>
+            <w:r>
+              <w:rPr>
+                <w:rFonts w:ascii="Times New Roman" w:hAnsi="Times New Roman" w:cs="Times New Roman"/>
+                <w:color w:val="0070C0"/>
+                <w:sz w:val="22"/>
+                <w:szCs w:val="22"/>
+              </w:rPr>
+              <w:t>{Owner}</w:t>
+            </w:r>
+          </w:p>
+          <w:p>
+            <w:pPr>
+              <w:spacing w:line="276" w:lineRule="auto"/>
+              <w:rPr>
+                <w:rFonts w:ascii="Times New Roman" w:hAnsi="Times New Roman" w:cs="Times New Roman"/>
+                <w:color w:val="0070C0"/>
+                <w:sz w:val="22"/>
+                <w:szCs w:val="22"/>
+              </w:rPr>
+            </w:pPr>
           </w:p>
         </w:tc>
       </w:tr>
@@ -16842,65 +15160,6 @@
                 <w:sz w:val="22"/>
                 <w:szCs w:val="22"/>
               </w:rPr>
-              <w:t>Owner</w:t>
-            </w:r>
-          </w:p>
-        </w:tc>
-        <w:tc>
-          <w:tcPr>
-            <w:tcW w:w="6461" w:type="dxa"/>
-          </w:tcPr>
-          <w:p>
-            <w:pPr>
-              <w:spacing w:line="276" w:lineRule="auto"/>
-              <w:rPr>
-                <w:rFonts w:ascii="Times New Roman" w:hAnsi="Times New Roman" w:cs="Times New Roman"/>
-                <w:color w:val="0070C0"/>
-                <w:sz w:val="22"/>
-                <w:szCs w:val="22"/>
-              </w:rPr>
-            </w:pPr>
-            <w:r>
-              <w:rPr>
-                <w:rFonts w:ascii="Times New Roman" w:hAnsi="Times New Roman" w:cs="Times New Roman"/>
-                <w:color w:val="0070C0"/>
-                <w:sz w:val="22"/>
-                <w:szCs w:val="22"/>
-              </w:rPr>
-              <w:t>{</w:t>
-            </w:r>
-            <w:r>
-              <w:rPr>
-                <w:rFonts w:ascii="Times New Roman" w:hAnsi="Times New Roman" w:cs="Times New Roman"/>
-                <w:color w:val="0070C0"/>
-                <w:sz w:val="22"/>
-                <w:szCs w:val="22"/>
-              </w:rPr>
-              <w:t>Owner}</w:t>
-            </w:r>
-          </w:p>
-        </w:tc>
-      </w:tr>
-      <w:tr>
-        <w:tc>
-          <w:tcPr>
-            <w:tcW w:w="2496" w:type="dxa"/>
-          </w:tcPr>
-          <w:p>
-            <w:pPr>
-              <w:spacing w:line="276" w:lineRule="auto"/>
-              <w:rPr>
-                <w:rFonts w:ascii="Times New Roman" w:hAnsi="Times New Roman" w:cs="Times New Roman"/>
-                <w:sz w:val="22"/>
-                <w:szCs w:val="22"/>
-              </w:rPr>
-            </w:pPr>
-            <w:r>
-              <w:rPr>
-                <w:rFonts w:ascii="Times New Roman" w:hAnsi="Times New Roman" w:cs="Times New Roman"/>
-                <w:sz w:val="22"/>
-                <w:szCs w:val="22"/>
-              </w:rPr>
               <w:t>Target Date / Status</w:t>
             </w:r>
           </w:p>
@@ -16960,6 +15219,17 @@
         </w:tc>
       </w:tr>
     </w:tbl>
+    <w:p>
+      <w:pPr>
+        <w:spacing w:line="276" w:lineRule="auto"/>
+        <w:jc w:val="both"/>
+        <w:rPr>
+          <w:rFonts w:ascii="Times New Roman" w:hAnsi="Times New Roman" w:cs="Times New Roman"/>
+          <w:b/>
+          <w:bCs/>
+        </w:rPr>
+      </w:pPr>
+    </w:p>
     <w:p>
       <w:pPr>
         <w:spacing w:line="276" w:lineRule="auto"/>
@@ -16986,23 +15256,7 @@
           <w:b/>
           <w:bCs/>
         </w:rPr>
-        <w:t>Control</w:t>
-      </w:r>
-      <w:r>
-        <w:rPr>
-          <w:rFonts w:ascii="Times New Roman" w:hAnsi="Times New Roman" w:cs="Times New Roman"/>
-          <w:b/>
-          <w:bCs/>
-        </w:rPr>
-        <w:t>_</w:t>
-      </w:r>
-      <w:r>
-        <w:rPr>
-          <w:rFonts w:ascii="Times New Roman" w:hAnsi="Times New Roman" w:cs="Times New Roman"/>
-          <w:b/>
-          <w:bCs/>
-        </w:rPr>
-        <w:t>Name</w:t>
+        <w:t>Control_Name</w:t>
       </w:r>
       <w:proofErr w:type="spellEnd"/>
       <w:r>
@@ -17011,15 +15265,7 @@
           <w:b/>
           <w:bCs/>
         </w:rPr>
-        <w:t>}</w:t>
-      </w:r>
-      <w:r>
-        <w:rPr>
-          <w:rFonts w:ascii="Times New Roman" w:hAnsi="Times New Roman" w:cs="Times New Roman"/>
-          <w:b/>
-          <w:bCs/>
-        </w:rPr>
-        <w:t xml:space="preserve"> - (High)</w:t>
+        <w:t>} - (High)</w:t>
       </w:r>
     </w:p>
     <w:tbl>
@@ -18139,18 +16385,8 @@
                 <w:sz w:val="22"/>
                 <w:szCs w:val="22"/>
               </w:rPr>
-              <w:t>Recommendation (Legacy)</w:t>
-            </w:r>
-          </w:p>
-          <w:p>
-            <w:pPr>
-              <w:spacing w:line="276" w:lineRule="auto"/>
-              <w:rPr>
-                <w:rFonts w:ascii="Times New Roman" w:hAnsi="Times New Roman" w:cs="Times New Roman"/>
-                <w:sz w:val="22"/>
-                <w:szCs w:val="22"/>
-              </w:rPr>
-            </w:pPr>
+              <w:t>Owner</w:t>
+            </w:r>
           </w:p>
         </w:tc>
         <w:tc>
@@ -18162,19 +16398,31 @@
               <w:spacing w:line="276" w:lineRule="auto"/>
               <w:rPr>
                 <w:rFonts w:ascii="Times New Roman" w:hAnsi="Times New Roman" w:cs="Times New Roman"/>
-                <w:sz w:val="22"/>
-                <w:szCs w:val="22"/>
-              </w:rPr>
-            </w:pPr>
-            <w:r>
-              <w:rPr>
-                <w:rFonts w:ascii="Times New Roman" w:hAnsi="Times New Roman" w:cs="Times New Roman"/>
-                <w:color w:val="0070C0"/>
-                <w:sz w:val="22"/>
-                <w:szCs w:val="22"/>
-              </w:rPr>
-              <w:t>{Recommendations}</w:t>
-            </w:r>
+                <w:color w:val="0070C0"/>
+                <w:sz w:val="22"/>
+                <w:szCs w:val="22"/>
+              </w:rPr>
+            </w:pPr>
+            <w:r>
+              <w:rPr>
+                <w:rFonts w:ascii="Times New Roman" w:hAnsi="Times New Roman" w:cs="Times New Roman"/>
+                <w:color w:val="0070C0"/>
+                <w:sz w:val="22"/>
+                <w:szCs w:val="22"/>
+              </w:rPr>
+              <w:t>{Owner}</w:t>
+            </w:r>
+          </w:p>
+          <w:p>
+            <w:pPr>
+              <w:spacing w:line="276" w:lineRule="auto"/>
+              <w:rPr>
+                <w:rFonts w:ascii="Times New Roman" w:hAnsi="Times New Roman" w:cs="Times New Roman"/>
+                <w:color w:val="0070C0"/>
+                <w:sz w:val="22"/>
+                <w:szCs w:val="22"/>
+              </w:rPr>
+            </w:pPr>
           </w:p>
         </w:tc>
       </w:tr>
@@ -18198,66 +16446,6 @@
                 <w:sz w:val="22"/>
                 <w:szCs w:val="22"/>
               </w:rPr>
-              <w:t>Owner</w:t>
-            </w:r>
-          </w:p>
-        </w:tc>
-        <w:tc>
-          <w:tcPr>
-            <w:tcW w:w="6461" w:type="dxa"/>
-          </w:tcPr>
-          <w:p>
-            <w:pPr>
-              <w:spacing w:line="276" w:lineRule="auto"/>
-              <w:rPr>
-                <w:rFonts w:ascii="Times New Roman" w:hAnsi="Times New Roman" w:cs="Times New Roman"/>
-                <w:color w:val="0070C0"/>
-                <w:sz w:val="22"/>
-                <w:szCs w:val="22"/>
-              </w:rPr>
-            </w:pPr>
-            <w:r>
-              <w:rPr>
-                <w:rFonts w:ascii="Times New Roman" w:hAnsi="Times New Roman" w:cs="Times New Roman"/>
-                <w:color w:val="0070C0"/>
-                <w:sz w:val="22"/>
-                <w:szCs w:val="22"/>
-              </w:rPr>
-              <w:t>{Owner}</w:t>
-            </w:r>
-          </w:p>
-          <w:p>
-            <w:pPr>
-              <w:spacing w:line="276" w:lineRule="auto"/>
-              <w:rPr>
-                <w:rFonts w:ascii="Times New Roman" w:hAnsi="Times New Roman" w:cs="Times New Roman"/>
-                <w:sz w:val="22"/>
-                <w:szCs w:val="22"/>
-              </w:rPr>
-            </w:pPr>
-          </w:p>
-        </w:tc>
-      </w:tr>
-      <w:tr>
-        <w:tc>
-          <w:tcPr>
-            <w:tcW w:w="2496" w:type="dxa"/>
-          </w:tcPr>
-          <w:p>
-            <w:pPr>
-              <w:spacing w:line="276" w:lineRule="auto"/>
-              <w:rPr>
-                <w:rFonts w:ascii="Times New Roman" w:hAnsi="Times New Roman" w:cs="Times New Roman"/>
-                <w:sz w:val="22"/>
-                <w:szCs w:val="22"/>
-              </w:rPr>
-            </w:pPr>
-            <w:r>
-              <w:rPr>
-                <w:rFonts w:ascii="Times New Roman" w:hAnsi="Times New Roman" w:cs="Times New Roman"/>
-                <w:sz w:val="22"/>
-                <w:szCs w:val="22"/>
-              </w:rPr>
               <w:t>Target Date / Status</w:t>
             </w:r>
           </w:p>
@@ -18338,6 +16526,28 @@
           <w:bCs/>
           <w:sz w:val="32"/>
           <w:szCs w:val="32"/>
+        </w:rPr>
+      </w:pPr>
+    </w:p>
+    <w:p>
+      <w:pPr>
+        <w:spacing w:line="276" w:lineRule="auto"/>
+        <w:jc w:val="both"/>
+        <w:rPr>
+          <w:rFonts w:ascii="Times New Roman" w:hAnsi="Times New Roman" w:cs="Times New Roman"/>
+          <w:b/>
+          <w:bCs/>
+        </w:rPr>
+      </w:pPr>
+    </w:p>
+    <w:p>
+      <w:pPr>
+        <w:spacing w:line="276" w:lineRule="auto"/>
+        <w:jc w:val="both"/>
+        <w:rPr>
+          <w:rFonts w:ascii="Times New Roman" w:hAnsi="Times New Roman" w:cs="Times New Roman"/>
+          <w:b/>
+          <w:bCs/>
         </w:rPr>
       </w:pPr>
     </w:p>
@@ -18367,23 +16577,7 @@
           <w:b/>
           <w:bCs/>
         </w:rPr>
-        <w:t>Control</w:t>
-      </w:r>
-      <w:r>
-        <w:rPr>
-          <w:rFonts w:ascii="Times New Roman" w:hAnsi="Times New Roman" w:cs="Times New Roman"/>
-          <w:b/>
-          <w:bCs/>
-        </w:rPr>
-        <w:t>_</w:t>
-      </w:r>
-      <w:r>
-        <w:rPr>
-          <w:rFonts w:ascii="Times New Roman" w:hAnsi="Times New Roman" w:cs="Times New Roman"/>
-          <w:b/>
-          <w:bCs/>
-        </w:rPr>
-        <w:t>Name</w:t>
+        <w:t>Control_Name</w:t>
       </w:r>
       <w:proofErr w:type="spellEnd"/>
       <w:r>
@@ -18392,15 +16586,7 @@
           <w:b/>
           <w:bCs/>
         </w:rPr>
-        <w:t>}</w:t>
-      </w:r>
-      <w:r>
-        <w:rPr>
-          <w:rFonts w:ascii="Times New Roman" w:hAnsi="Times New Roman" w:cs="Times New Roman"/>
-          <w:b/>
-          <w:bCs/>
-        </w:rPr>
-        <w:t xml:space="preserve"> - (Medium)</w:t>
+        <w:t>} - (Medium)</w:t>
       </w:r>
     </w:p>
     <w:tbl>
@@ -19520,18 +17706,8 @@
                 <w:sz w:val="22"/>
                 <w:szCs w:val="22"/>
               </w:rPr>
-              <w:t>Recommendation (Legacy)</w:t>
-            </w:r>
-          </w:p>
-          <w:p>
-            <w:pPr>
-              <w:spacing w:line="276" w:lineRule="auto"/>
-              <w:rPr>
-                <w:rFonts w:ascii="Times New Roman" w:hAnsi="Times New Roman" w:cs="Times New Roman"/>
-                <w:sz w:val="22"/>
-                <w:szCs w:val="22"/>
-              </w:rPr>
-            </w:pPr>
+              <w:t>Owner</w:t>
+            </w:r>
           </w:p>
         </w:tc>
         <w:tc>
@@ -19543,19 +17719,31 @@
               <w:spacing w:line="276" w:lineRule="auto"/>
               <w:rPr>
                 <w:rFonts w:ascii="Times New Roman" w:hAnsi="Times New Roman" w:cs="Times New Roman"/>
-                <w:sz w:val="22"/>
-                <w:szCs w:val="22"/>
-              </w:rPr>
-            </w:pPr>
-            <w:r>
-              <w:rPr>
-                <w:rFonts w:ascii="Times New Roman" w:hAnsi="Times New Roman" w:cs="Times New Roman"/>
-                <w:color w:val="0070C0"/>
-                <w:sz w:val="22"/>
-                <w:szCs w:val="22"/>
-              </w:rPr>
-              <w:t>{Recommendations}</w:t>
-            </w:r>
+                <w:color w:val="0070C0"/>
+                <w:sz w:val="22"/>
+                <w:szCs w:val="22"/>
+              </w:rPr>
+            </w:pPr>
+            <w:r>
+              <w:rPr>
+                <w:rFonts w:ascii="Times New Roman" w:hAnsi="Times New Roman" w:cs="Times New Roman"/>
+                <w:color w:val="0070C0"/>
+                <w:sz w:val="22"/>
+                <w:szCs w:val="22"/>
+              </w:rPr>
+              <w:t>{Owner}</w:t>
+            </w:r>
+          </w:p>
+          <w:p>
+            <w:pPr>
+              <w:spacing w:line="276" w:lineRule="auto"/>
+              <w:rPr>
+                <w:rFonts w:ascii="Times New Roman" w:hAnsi="Times New Roman" w:cs="Times New Roman"/>
+                <w:color w:val="0070C0"/>
+                <w:sz w:val="22"/>
+                <w:szCs w:val="22"/>
+              </w:rPr>
+            </w:pPr>
           </w:p>
         </w:tc>
       </w:tr>
@@ -19579,66 +17767,6 @@
                 <w:sz w:val="22"/>
                 <w:szCs w:val="22"/>
               </w:rPr>
-              <w:t>Owner</w:t>
-            </w:r>
-          </w:p>
-        </w:tc>
-        <w:tc>
-          <w:tcPr>
-            <w:tcW w:w="6461" w:type="dxa"/>
-          </w:tcPr>
-          <w:p>
-            <w:pPr>
-              <w:spacing w:line="276" w:lineRule="auto"/>
-              <w:rPr>
-                <w:rFonts w:ascii="Times New Roman" w:hAnsi="Times New Roman" w:cs="Times New Roman"/>
-                <w:color w:val="0070C0"/>
-                <w:sz w:val="22"/>
-                <w:szCs w:val="22"/>
-              </w:rPr>
-            </w:pPr>
-            <w:r>
-              <w:rPr>
-                <w:rFonts w:ascii="Times New Roman" w:hAnsi="Times New Roman" w:cs="Times New Roman"/>
-                <w:color w:val="0070C0"/>
-                <w:sz w:val="22"/>
-                <w:szCs w:val="22"/>
-              </w:rPr>
-              <w:t>{Owner}</w:t>
-            </w:r>
-          </w:p>
-          <w:p>
-            <w:pPr>
-              <w:spacing w:line="276" w:lineRule="auto"/>
-              <w:rPr>
-                <w:rFonts w:ascii="Times New Roman" w:hAnsi="Times New Roman" w:cs="Times New Roman"/>
-                <w:sz w:val="22"/>
-                <w:szCs w:val="22"/>
-              </w:rPr>
-            </w:pPr>
-          </w:p>
-        </w:tc>
-      </w:tr>
-      <w:tr>
-        <w:tc>
-          <w:tcPr>
-            <w:tcW w:w="2496" w:type="dxa"/>
-          </w:tcPr>
-          <w:p>
-            <w:pPr>
-              <w:spacing w:line="276" w:lineRule="auto"/>
-              <w:rPr>
-                <w:rFonts w:ascii="Times New Roman" w:hAnsi="Times New Roman" w:cs="Times New Roman"/>
-                <w:sz w:val="22"/>
-                <w:szCs w:val="22"/>
-              </w:rPr>
-            </w:pPr>
-            <w:r>
-              <w:rPr>
-                <w:rFonts w:ascii="Times New Roman" w:hAnsi="Times New Roman" w:cs="Times New Roman"/>
-                <w:sz w:val="22"/>
-                <w:szCs w:val="22"/>
-              </w:rPr>
               <w:t>Target Date / Status</w:t>
             </w:r>
           </w:p>
@@ -19713,6 +17841,7 @@
     <w:p>
       <w:pPr>
         <w:spacing w:line="276" w:lineRule="auto"/>
+        <w:jc w:val="both"/>
         <w:rPr>
           <w:rFonts w:ascii="Times New Roman" w:hAnsi="Times New Roman" w:cs="Times New Roman"/>
           <w:b/>
@@ -19722,17 +17851,6 @@
           <w:szCs w:val="18"/>
         </w:rPr>
       </w:pPr>
-      <w:r>
-        <w:rPr>
-          <w:rFonts w:ascii="Times New Roman" w:hAnsi="Times New Roman" w:cs="Times New Roman"/>
-          <w:b/>
-          <w:bCs/>
-          <w:color w:val="ADADAD" w:themeColor="background2" w:themeShade="BF"/>
-          <w:sz w:val="18"/>
-          <w:szCs w:val="18"/>
-        </w:rPr>
-        <w:t>[Evidence embeds: [Embed evidence here]]</w:t>
-      </w:r>
     </w:p>
     <w:p>
       <w:pPr>
@@ -19744,6 +17862,28 @@
           <w:bCs/>
         </w:rPr>
       </w:pPr>
+    </w:p>
+    <w:p>
+      <w:pPr>
+        <w:spacing w:line="276" w:lineRule="auto"/>
+        <w:jc w:val="both"/>
+        <w:rPr>
+          <w:rFonts w:ascii="Times New Roman" w:hAnsi="Times New Roman" w:cs="Times New Roman"/>
+          <w:b/>
+          <w:bCs/>
+        </w:rPr>
+      </w:pPr>
+    </w:p>
+    <w:p>
+      <w:pPr>
+        <w:spacing w:line="276" w:lineRule="auto"/>
+        <w:jc w:val="both"/>
+        <w:rPr>
+          <w:rFonts w:ascii="Times New Roman" w:hAnsi="Times New Roman" w:cs="Times New Roman"/>
+          <w:b/>
+          <w:bCs/>
+        </w:rPr>
+      </w:pPr>
       <w:r>
         <w:rPr>
           <w:rFonts w:ascii="Times New Roman" w:hAnsi="Times New Roman" w:cs="Times New Roman"/>
@@ -19751,39 +17891,25 @@
           <w:bCs/>
         </w:rPr>
         <w:lastRenderedPageBreak/>
-        <w:t>6.</w:t>
+        <w:t>6.4 {</w:t>
       </w:r>
+      <w:proofErr w:type="spellStart"/>
       <w:r>
         <w:rPr>
           <w:rFonts w:ascii="Times New Roman" w:hAnsi="Times New Roman" w:cs="Times New Roman"/>
           <w:b/>
           <w:bCs/>
         </w:rPr>
-        <w:t>4</w:t>
+        <w:t>Control_Name</w:t>
       </w:r>
+      <w:proofErr w:type="spellEnd"/>
       <w:r>
         <w:rPr>
           <w:rFonts w:ascii="Times New Roman" w:hAnsi="Times New Roman" w:cs="Times New Roman"/>
           <w:b/>
           <w:bCs/>
         </w:rPr>
-        <w:t xml:space="preserve"> {Control</w:t>
-      </w:r>
-      <w:r>
-        <w:rPr>
-          <w:rFonts w:ascii="Times New Roman" w:hAnsi="Times New Roman" w:cs="Times New Roman"/>
-          <w:b/>
-          <w:bCs/>
-        </w:rPr>
-        <w:t>_</w:t>
-      </w:r>
-      <w:r>
-        <w:rPr>
-          <w:rFonts w:ascii="Times New Roman" w:hAnsi="Times New Roman" w:cs="Times New Roman"/>
-          <w:b/>
-          <w:bCs/>
-        </w:rPr>
-        <w:t>Name} - (Low)</w:t>
+        <w:t>} - (Low)</w:t>
       </w:r>
     </w:p>
     <w:tbl>
@@ -20903,18 +19029,8 @@
                 <w:sz w:val="22"/>
                 <w:szCs w:val="22"/>
               </w:rPr>
-              <w:t>Recommendation (Legacy)</w:t>
-            </w:r>
-          </w:p>
-          <w:p>
-            <w:pPr>
-              <w:spacing w:line="276" w:lineRule="auto"/>
-              <w:rPr>
-                <w:rFonts w:ascii="Times New Roman" w:hAnsi="Times New Roman" w:cs="Times New Roman"/>
-                <w:sz w:val="22"/>
-                <w:szCs w:val="22"/>
-              </w:rPr>
-            </w:pPr>
+              <w:t>Owner</w:t>
+            </w:r>
           </w:p>
         </w:tc>
         <w:tc>
@@ -20926,77 +19042,19 @@
               <w:spacing w:line="276" w:lineRule="auto"/>
               <w:rPr>
                 <w:rFonts w:ascii="Times New Roman" w:hAnsi="Times New Roman" w:cs="Times New Roman"/>
-                <w:sz w:val="22"/>
-                <w:szCs w:val="22"/>
-              </w:rPr>
-            </w:pPr>
-            <w:r>
-              <w:rPr>
-                <w:rFonts w:ascii="Times New Roman" w:hAnsi="Times New Roman" w:cs="Times New Roman"/>
-                <w:color w:val="0070C0"/>
-                <w:sz w:val="22"/>
-                <w:szCs w:val="22"/>
-              </w:rPr>
-              <w:t>{Recommendations}</w:t>
-            </w:r>
-          </w:p>
-        </w:tc>
-      </w:tr>
-      <w:tr>
-        <w:tc>
-          <w:tcPr>
-            <w:tcW w:w="2496" w:type="dxa"/>
-          </w:tcPr>
-          <w:p>
-            <w:pPr>
-              <w:spacing w:line="276" w:lineRule="auto"/>
-              <w:rPr>
-                <w:rFonts w:ascii="Times New Roman" w:hAnsi="Times New Roman" w:cs="Times New Roman"/>
-                <w:sz w:val="22"/>
-                <w:szCs w:val="22"/>
-              </w:rPr>
-            </w:pPr>
-            <w:r>
-              <w:rPr>
-                <w:rFonts w:ascii="Times New Roman" w:hAnsi="Times New Roman" w:cs="Times New Roman"/>
-                <w:sz w:val="22"/>
-                <w:szCs w:val="22"/>
-              </w:rPr>
-              <w:t>Owner</w:t>
-            </w:r>
-          </w:p>
-        </w:tc>
-        <w:tc>
-          <w:tcPr>
-            <w:tcW w:w="6461" w:type="dxa"/>
-          </w:tcPr>
-          <w:p>
-            <w:pPr>
-              <w:spacing w:line="276" w:lineRule="auto"/>
-              <w:rPr>
-                <w:rFonts w:ascii="Times New Roman" w:hAnsi="Times New Roman" w:cs="Times New Roman"/>
-                <w:color w:val="0070C0"/>
-                <w:sz w:val="22"/>
-                <w:szCs w:val="22"/>
-              </w:rPr>
-            </w:pPr>
-            <w:r>
-              <w:rPr>
-                <w:rFonts w:ascii="Times New Roman" w:hAnsi="Times New Roman" w:cs="Times New Roman"/>
-                <w:color w:val="0070C0"/>
-                <w:sz w:val="22"/>
-                <w:szCs w:val="22"/>
-              </w:rPr>
-              <w:t>{</w:t>
-            </w:r>
-            <w:r>
-              <w:rPr>
-                <w:rFonts w:ascii="Times New Roman" w:hAnsi="Times New Roman" w:cs="Times New Roman"/>
-                <w:color w:val="0070C0"/>
-                <w:sz w:val="22"/>
-                <w:szCs w:val="22"/>
-              </w:rPr>
-              <w:t>Owner}</w:t>
+                <w:color w:val="0070C0"/>
+                <w:sz w:val="22"/>
+                <w:szCs w:val="22"/>
+              </w:rPr>
+            </w:pPr>
+            <w:r>
+              <w:rPr>
+                <w:rFonts w:ascii="Times New Roman" w:hAnsi="Times New Roman" w:cs="Times New Roman"/>
+                <w:color w:val="0070C0"/>
+                <w:sz w:val="22"/>
+                <w:szCs w:val="22"/>
+              </w:rPr>
+              <w:t>{Owner}</w:t>
             </w:r>
           </w:p>
           <w:p>
@@ -21138,7 +19196,10 @@
           <w:szCs w:val="32"/>
         </w:rPr>
       </w:pPr>
-      <w:r>
+    </w:p>
+    <w:p>
+      <w:pPr>
+        <w:spacing w:line="360" w:lineRule="auto"/>
         <w:rPr>
           <w:rFonts w:ascii="Times New Roman" w:hAnsi="Times New Roman" w:cs="Times New Roman"/>
           <w:b/>
@@ -21146,10 +19207,11 @@
           <w:sz w:val="32"/>
           <w:szCs w:val="32"/>
         </w:rPr>
-        <w:lastRenderedPageBreak/>
-        <w:t xml:space="preserve">7. </w:t>
-      </w:r>
-      <w:r>
+      </w:pPr>
+    </w:p>
+    <w:p>
+      <w:pPr>
+        <w:spacing w:line="360" w:lineRule="auto"/>
         <w:rPr>
           <w:rFonts w:ascii="Times New Roman" w:hAnsi="Times New Roman" w:cs="Times New Roman"/>
           <w:b/>
@@ -21157,7 +19219,17 @@
           <w:sz w:val="32"/>
           <w:szCs w:val="32"/>
         </w:rPr>
-        <w:t>Recommendations and Remediation Plan</w:t>
+      </w:pPr>
+      <w:r>
+        <w:rPr>
+          <w:rFonts w:ascii="Times New Roman" w:hAnsi="Times New Roman" w:cs="Times New Roman"/>
+          <w:b/>
+          <w:bCs/>
+          <w:sz w:val="32"/>
+          <w:szCs w:val="32"/>
+        </w:rPr>
+        <w:lastRenderedPageBreak/>
+        <w:t>7. Recommendations and Remediation Plan</w:t>
       </w:r>
     </w:p>
     <w:p>
@@ -21178,15 +19250,7 @@
           <w:b/>
           <w:bCs/>
         </w:rPr>
-        <w:t xml:space="preserve">7.1 </w:t>
-      </w:r>
-      <w:r>
-        <w:rPr>
-          <w:rFonts w:ascii="Times New Roman" w:hAnsi="Times New Roman" w:cs="Times New Roman"/>
-          <w:b/>
-          <w:bCs/>
-        </w:rPr>
-        <w:t>Prioritised Actions</w:t>
+        <w:t>7.1 Prioritised Actions</w:t>
       </w:r>
     </w:p>
     <w:p>
@@ -21586,25 +19650,7 @@
                 <w:sz w:val="22"/>
                 <w:szCs w:val="22"/>
               </w:rPr>
-              <w:t>{</w:t>
-            </w:r>
-            <w:r>
-              <w:rPr>
-                <w:rFonts w:ascii="Times New Roman" w:hAnsi="Times New Roman" w:cs="Times New Roman"/>
-                <w:color w:val="0070C0"/>
-                <w:sz w:val="22"/>
-                <w:szCs w:val="22"/>
-              </w:rPr>
-              <w:t>Remediation_Status</w:t>
-            </w:r>
-            <w:r>
-              <w:rPr>
-                <w:rFonts w:ascii="Times New Roman" w:hAnsi="Times New Roman" w:cs="Times New Roman"/>
-                <w:color w:val="0070C0"/>
-                <w:sz w:val="22"/>
-                <w:szCs w:val="22"/>
-              </w:rPr>
-              <w:t>}</w:t>
+              <w:t>{Remediation_Status}</w:t>
             </w:r>
           </w:p>
         </w:tc>
@@ -22985,17 +21031,7 @@
           <w:szCs w:val="32"/>
         </w:rPr>
         <w:lastRenderedPageBreak/>
-        <w:t xml:space="preserve">8. </w:t>
-      </w:r>
-      <w:r>
-        <w:rPr>
-          <w:rFonts w:ascii="Times New Roman" w:hAnsi="Times New Roman" w:cs="Times New Roman"/>
-          <w:b/>
-          <w:bCs/>
-          <w:sz w:val="32"/>
-          <w:szCs w:val="32"/>
-        </w:rPr>
-        <w:t>Conclusion</w:t>
+        <w:t>8. Conclusion</w:t>
       </w:r>
     </w:p>
     <w:p>
@@ -26914,7 +24950,7 @@
         </mc:Choice>
         <mc:Fallback>
           <w:pict>
-            <v:line w14:anchorId="075C3EBB" id="Straight Connector 2" o:spid="_x0000_s1026" style="position:absolute;z-index:251661312;visibility:visible;mso-wrap-style:square;mso-wrap-distance-left:9pt;mso-wrap-distance-top:0;mso-wrap-distance-right:9pt;mso-wrap-distance-bottom:0;mso-position-horizontal:absolute;mso-position-horizontal-relative:text;mso-position-vertical:absolute;mso-position-vertical-relative:text" from="-2.6pt,6.6pt" to="454.3pt,6.6pt" o:gfxdata="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" strokecolor="black [3200]" strokeweight="1.5pt">
+            <v:line w14:anchorId="075C3EBB" id="Straight Connector 2" o:spid="_x0000_s1026" style="position:absolute;z-index:251661312;visibility:visible;mso-wrap-style:square;mso-wrap-distance-left:9pt;mso-wrap-distance-top:0;mso-wrap-distance-right:9pt;mso-wrap-distance-bottom:0;mso-position-horizontal:absolute;mso-position-horizontal-relative:text;mso-position-vertical:absolute;mso-position-vertical-relative:text" from="-2.6pt,6.6pt" to="454.3pt,6.6pt" o:gfxdata="UEsDBBQABgAIAAAAIQC2gziS/gAAAOEBAAATAAAAW0NvbnRlbnRfVHlwZXNdLnhtbJSRQU7DMBBF 90jcwfIWJU67QAgl6YK0S0CoHGBkTxKLZGx5TGhvj5O2G0SRWNoz/78nu9wcxkFMGNg6quQqL6RA 0s5Y6ir5vt9lD1JwBDIwOMJKHpHlpr69KfdHjyxSmriSfYz+USnWPY7AufNIadK6MEJMx9ApD/oD OlTrorhX2lFEilmcO2RdNtjC5xDF9pCuTyYBB5bi6bQ4syoJ3g9WQ0ymaiLzg5KdCXlKLjvcW893 SUOqXwnz5DrgnHtJTxOsQfEKIT7DmDSUCaxw7Rqn8787ZsmRM9e2VmPeBN4uqYvTtW7jvijg9N/y JsXecLq0q+WD6m8AAAD//wMAUEsDBBQABgAIAAAAIQA4/SH/1gAAAJQBAAALAAAAX3JlbHMvLnJl bHOkkMFqwzAMhu+DvYPRfXGawxijTi+j0GvpHsDYimMaW0Yy2fr2M4PBMnrbUb/Q94l/f/hMi1qR JVI2sOt6UJgd+ZiDgffL8ekFlFSbvV0oo4EbChzGx4f9GRdb25HMsYhqlCwG5lrLq9biZkxWOiqY 22YiTra2kYMu1l1tQD30/bPm3wwYN0x18gb45AdQl1tp5j/sFB2T0FQ7R0nTNEV3j6o9feQzro1i OWA14Fm+Q8a1a8+Bvu/d/dMb2JY5uiPbhG/ktn4cqGU/er3pcvwCAAD//wMAUEsDBBQABgAIAAAA IQAodZ9YnAEAAIgDAAAOAAAAZHJzL2Uyb0RvYy54bWysU8tu2zAQvAfoPxC815LdpHAFyzkkaC9B EjTJBzDU0iLCF5aMJf99lrQtF2mRQ5ELxcfM7M7uanU5WsO2gFF71/L5rOYMnPSddpuWPz3+/Lrk LCbhOmG8g5bvIPLL9Zez1RAaWPjemw6QkYiLzRBa3qcUmqqKsgcr4swHcPSoPFqR6IibqkMxkLo1 1aKuv1eDxy6glxAj3V7vH/m66CsFMt0pFSEx03LKLZUVy/qc12q9Es0GRei1PKQh/iMLK7SjoJPU tUiCvaL+S8pqiT56lWbS28orpSUUD+RmXr9z89CLAMULFSeGqUzx82Tl7fbK3SOVYQixieEes4tR oc1fyo+NpVi7qVgwJibp8mJZL86XPziTx7fqRAwY0y/wluVNy4122YdoxPYmJgpG0COEDqfQZZd2 BjLYuN+gmO4o2LfCLlMBVwbZVlA/u5d57h9pFWSmKG3MRKo/Jh2wmQZlUibi4mPihC4RvUsT0Wrn 8V/kNB5TVXv80fXea7b97LtdaUQpB7W7ODuMZp6nP8+FfvqB1m8AAAD//wMAUEsDBBQABgAIAAAA IQA8RYYL4QAAAA0BAAAPAAAAZHJzL2Rvd25yZXYueG1sTE9BTsNADLwj8YeVkbigdkMhbUmzqRCI Q5BAoq04u4mbBLLeKLtNw+8x4gAXW56xxzPperStGqj3jWMD19MIFHHhyoYrA7vt02QJygfkElvH ZOCLPKyz87MUk9Kd+I2GTaiUiLBP0EAdQpdo7YuaLPqp64iFO7jeYpCxr3TZ40nEbatnUTTXFhuW DzV29FBT8bk5WgMf+XtexVeL5vB6Gz/jdohfeMiNubwYH1dS7legAo3h7wJ+Moh/yMTY3h259Ko1 MIlnsin4jXTh76LlHNT+F9BZqv+nyL4BAAD//wMAUEsBAi0AFAAGAAgAAAAhALaDOJL+AAAA4QEA ABMAAAAAAAAAAAAAAAAAAAAAAFtDb250ZW50X1R5cGVzXS54bWxQSwECLQAUAAYACAAAACEAOP0h /9YAAACUAQAACwAAAAAAAAAAAAAAAAAvAQAAX3JlbHMvLnJlbHNQSwECLQAUAAYACAAAACEAKHWf WJwBAACIAwAADgAAAAAAAAAAAAAAAAAuAgAAZHJzL2Uyb0RvYy54bWxQSwECLQAUAAYACAAAACEA PEWGC+EAAAANAQAADwAAAAAAAAAAAAAAAAD2AwAAZHJzL2Rvd25yZXYueG1sUEsFBgAAAAAEAAQA 8wAAAAQFAAAAAA== " strokecolor="black [3200]" strokeweight="1.5pt">
               <v:stroke joinstyle="miter"/>
             </v:line>
           </w:pict>
@@ -27235,7 +25271,7 @@
         </mc:Choice>
         <mc:Fallback>
           <w:pict>
-            <v:line w14:anchorId="6ECEAD6F" id="Straight Connector 2" o:spid="_x0000_s1026" style="position:absolute;z-index:251663360;visibility:visible;mso-wrap-style:square;mso-wrap-distance-left:9pt;mso-wrap-distance-top:0;mso-wrap-distance-right:9pt;mso-wrap-distance-bottom:0;mso-position-horizontal:absolute;mso-position-horizontal-relative:text;mso-position-vertical:absolute;mso-position-vertical-relative:text" from="-2.55pt,-5.4pt" to="454.35pt,-5.4pt" o:gfxdata="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" strokecolor="black [3200]" strokeweight="1.5pt">
+            <v:line w14:anchorId="6ECEAD6F" id="Straight Connector 2" o:spid="_x0000_s1026" style="position:absolute;z-index:251663360;visibility:visible;mso-wrap-style:square;mso-wrap-distance-left:9pt;mso-wrap-distance-top:0;mso-wrap-distance-right:9pt;mso-wrap-distance-bottom:0;mso-position-horizontal:absolute;mso-position-horizontal-relative:text;mso-position-vertical:absolute;mso-position-vertical-relative:text" from="-2.55pt,-5.4pt" to="454.35pt,-5.4pt" o:gfxdata="UEsDBBQABgAIAAAAIQC2gziS/gAAAOEBAAATAAAAW0NvbnRlbnRfVHlwZXNdLnhtbJSRQU7DMBBF 90jcwfIWJU67QAgl6YK0S0CoHGBkTxKLZGx5TGhvj5O2G0SRWNoz/78nu9wcxkFMGNg6quQqL6RA 0s5Y6ir5vt9lD1JwBDIwOMJKHpHlpr69KfdHjyxSmriSfYz+USnWPY7AufNIadK6MEJMx9ApD/oD OlTrorhX2lFEilmcO2RdNtjC5xDF9pCuTyYBB5bi6bQ4syoJ3g9WQ0ymaiLzg5KdCXlKLjvcW893 SUOqXwnz5DrgnHtJTxOsQfEKIT7DmDSUCaxw7Rqn8787ZsmRM9e2VmPeBN4uqYvTtW7jvijg9N/y JsXecLq0q+WD6m8AAAD//wMAUEsDBBQABgAIAAAAIQA4/SH/1gAAAJQBAAALAAAAX3JlbHMvLnJl bHOkkMFqwzAMhu+DvYPRfXGawxijTi+j0GvpHsDYimMaW0Yy2fr2M4PBMnrbUb/Q94l/f/hMi1qR JVI2sOt6UJgd+ZiDgffL8ekFlFSbvV0oo4EbChzGx4f9GRdb25HMsYhqlCwG5lrLq9biZkxWOiqY 22YiTra2kYMu1l1tQD30/bPm3wwYN0x18gb45AdQl1tp5j/sFB2T0FQ7R0nTNEV3j6o9feQzro1i OWA14Fm+Q8a1a8+Bvu/d/dMb2JY5uiPbhG/ktn4cqGU/er3pcvwCAAD//wMAUEsDBBQABgAIAAAA IQAodZ9YnAEAAIgDAAAOAAAAZHJzL2Uyb0RvYy54bWysU8tu2zAQvAfoPxC815LdpHAFyzkkaC9B EjTJBzDU0iLCF5aMJf99lrQtF2mRQ5ELxcfM7M7uanU5WsO2gFF71/L5rOYMnPSddpuWPz3+/Lrk LCbhOmG8g5bvIPLL9Zez1RAaWPjemw6QkYiLzRBa3qcUmqqKsgcr4swHcPSoPFqR6IibqkMxkLo1 1aKuv1eDxy6glxAj3V7vH/m66CsFMt0pFSEx03LKLZUVy/qc12q9Es0GRei1PKQh/iMLK7SjoJPU tUiCvaL+S8pqiT56lWbS28orpSUUD+RmXr9z89CLAMULFSeGqUzx82Tl7fbK3SOVYQixieEes4tR oc1fyo+NpVi7qVgwJibp8mJZL86XPziTx7fqRAwY0y/wluVNy4122YdoxPYmJgpG0COEDqfQZZd2 BjLYuN+gmO4o2LfCLlMBVwbZVlA/u5d57h9pFWSmKG3MRKo/Jh2wmQZlUibi4mPihC4RvUsT0Wrn 8V/kNB5TVXv80fXea7b97LtdaUQpB7W7ODuMZp6nP8+FfvqB1m8AAAD//wMAUEsDBBQABgAIAAAA IQB3qXyX4QAAAA8BAAAPAAAAZHJzL2Rvd25yZXYueG1sTE9NS8NAEL0L/odlBC/S7kaMrWk2RRQP ESrYiudpdptEs7Mhu03jv3cEQS8zzMyb95GvJ9eJ0Q6h9aQhmSsQlipvWqo1vO2eZksQISIZ7DxZ DV82wLo4P8sxM/5Er3bcxlowCYUMNTQx9pmUoWqswzD3vSW+HfzgMPI41NIMeGJy18lrpW6lw5ZY ocHePjS2+twenYaP8r2s06tFe3i5SZ9xN6YbGkutLy+mxxWX+xWIaKf49wE/Gdg/FGxs749kgug0 zNKEkdwTxTkYcKeWCxD7340scvk/R/ENAAD//wMAUEsBAi0AFAAGAAgAAAAhALaDOJL+AAAA4QEA ABMAAAAAAAAAAAAAAAAAAAAAAFtDb250ZW50X1R5cGVzXS54bWxQSwECLQAUAAYACAAAACEAOP0h /9YAAACUAQAACwAAAAAAAAAAAAAAAAAvAQAAX3JlbHMvLnJlbHNQSwECLQAUAAYACAAAACEAKHWf WJwBAACIAwAADgAAAAAAAAAAAAAAAAAuAgAAZHJzL2Uyb0RvYy54bWxQSwECLQAUAAYACAAAACEA d6l8l+EAAAAPAQAADwAAAAAAAAAAAAAAAAD2AwAAZHJzL2Rvd25yZXYueG1sUEsFBgAAAAAEAAQA 8wAAAAQFAAAAAA== " strokecolor="black [3200]" strokeweight="1.5pt">
               <v:stroke joinstyle="miter"/>
             </v:line>
           </w:pict>
@@ -27481,7 +25517,7 @@
         </mc:Choice>
         <mc:Fallback>
           <w:pict>
-            <v:line w14:anchorId="14AC4290" id="Straight Connector 2" o:spid="_x0000_s1026" style="position:absolute;z-index:251659264;visibility:visible;mso-wrap-style:square;mso-wrap-distance-left:9pt;mso-wrap-distance-top:0;mso-wrap-distance-right:9pt;mso-wrap-distance-bottom:0;mso-position-horizontal:absolute;mso-position-horizontal-relative:text;mso-position-vertical:absolute;mso-position-vertical-relative:text" from="-2.6pt,6.6pt" to="454.3pt,6.6pt" o:gfxdata="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" strokecolor="black [3200]" strokeweight="1.5pt">
+            <v:line w14:anchorId="14AC4290" id="Straight Connector 2" o:spid="_x0000_s1026" style="position:absolute;z-index:251659264;visibility:visible;mso-wrap-style:square;mso-wrap-distance-left:9pt;mso-wrap-distance-top:0;mso-wrap-distance-right:9pt;mso-wrap-distance-bottom:0;mso-position-horizontal:absolute;mso-position-horizontal-relative:text;mso-position-vertical:absolute;mso-position-vertical-relative:text" from="-2.6pt,6.6pt" to="454.3pt,6.6pt" o:gfxdata="UEsDBBQABgAIAAAAIQC2gziS/gAAAOEBAAATAAAAW0NvbnRlbnRfVHlwZXNdLnhtbJSRQU7DMBBF 90jcwfIWJU67QAgl6YK0S0CoHGBkTxKLZGx5TGhvj5O2G0SRWNoz/78nu9wcxkFMGNg6quQqL6RA 0s5Y6ir5vt9lD1JwBDIwOMJKHpHlpr69KfdHjyxSmriSfYz+USnWPY7AufNIadK6MEJMx9ApD/oD OlTrorhX2lFEilmcO2RdNtjC5xDF9pCuTyYBB5bi6bQ4syoJ3g9WQ0ymaiLzg5KdCXlKLjvcW893 SUOqXwnz5DrgnHtJTxOsQfEKIT7DmDSUCaxw7Rqn8787ZsmRM9e2VmPeBN4uqYvTtW7jvijg9N/y JsXecLq0q+WD6m8AAAD//wMAUEsDBBQABgAIAAAAIQA4/SH/1gAAAJQBAAALAAAAX3JlbHMvLnJl bHOkkMFqwzAMhu+DvYPRfXGawxijTi+j0GvpHsDYimMaW0Yy2fr2M4PBMnrbUb/Q94l/f/hMi1qR JVI2sOt6UJgd+ZiDgffL8ekFlFSbvV0oo4EbChzGx4f9GRdb25HMsYhqlCwG5lrLq9biZkxWOiqY 22YiTra2kYMu1l1tQD30/bPm3wwYN0x18gb45AdQl1tp5j/sFB2T0FQ7R0nTNEV3j6o9feQzro1i OWA14Fm+Q8a1a8+Bvu/d/dMb2JY5uiPbhG/ktn4cqGU/er3pcvwCAAD//wMAUEsDBBQABgAIAAAA IQAodZ9YnAEAAIgDAAAOAAAAZHJzL2Uyb0RvYy54bWysU8tu2zAQvAfoPxC815LdpHAFyzkkaC9B EjTJBzDU0iLCF5aMJf99lrQtF2mRQ5ELxcfM7M7uanU5WsO2gFF71/L5rOYMnPSddpuWPz3+/Lrk LCbhOmG8g5bvIPLL9Zez1RAaWPjemw6QkYiLzRBa3qcUmqqKsgcr4swHcPSoPFqR6IibqkMxkLo1 1aKuv1eDxy6glxAj3V7vH/m66CsFMt0pFSEx03LKLZUVy/qc12q9Es0GRei1PKQh/iMLK7SjoJPU tUiCvaL+S8pqiT56lWbS28orpSUUD+RmXr9z89CLAMULFSeGqUzx82Tl7fbK3SOVYQixieEes4tR oc1fyo+NpVi7qVgwJibp8mJZL86XPziTx7fqRAwY0y/wluVNy4122YdoxPYmJgpG0COEDqfQZZd2 BjLYuN+gmO4o2LfCLlMBVwbZVlA/u5d57h9pFWSmKG3MRKo/Jh2wmQZlUibi4mPihC4RvUsT0Wrn 8V/kNB5TVXv80fXea7b97LtdaUQpB7W7ODuMZp6nP8+FfvqB1m8AAAD//wMAUEsDBBQABgAIAAAA IQA8RYYL4QAAAA0BAAAPAAAAZHJzL2Rvd25yZXYueG1sTE9BTsNADLwj8YeVkbigdkMhbUmzqRCI Q5BAoq04u4mbBLLeKLtNw+8x4gAXW56xxzPperStGqj3jWMD19MIFHHhyoYrA7vt02QJygfkElvH ZOCLPKyz87MUk9Kd+I2GTaiUiLBP0EAdQpdo7YuaLPqp64iFO7jeYpCxr3TZ40nEbatnUTTXFhuW DzV29FBT8bk5WgMf+XtexVeL5vB6Gz/jdohfeMiNubwYH1dS7legAo3h7wJ+Moh/yMTY3h259Ko1 MIlnsin4jXTh76LlHNT+F9BZqv+nyL4BAAD//wMAUEsBAi0AFAAGAAgAAAAhALaDOJL+AAAA4QEA ABMAAAAAAAAAAAAAAAAAAAAAAFtDb250ZW50X1R5cGVzXS54bWxQSwECLQAUAAYACAAAACEAOP0h /9YAAACUAQAACwAAAAAAAAAAAAAAAAAvAQAAX3JlbHMvLnJlbHNQSwECLQAUAAYACAAAACEAKHWf WJwBAACIAwAADgAAAAAAAAAAAAAAAAAuAgAAZHJzL2Uyb0RvYy54bWxQSwECLQAUAAYACAAAACEA PEWGC+EAAAANAQAADwAAAAAAAAAAAAAAAAD2AwAAZHJzL2Rvd25yZXYueG1sUEsFBgAAAAAEAAQA 8wAAAAQFAAAAAA== " strokecolor="black [3200]" strokeweight="1.5pt">
               <v:stroke joinstyle="miter"/>
             </v:line>
           </w:pict>

</xml_diff>